<commit_message>
Almost clean and ready
</commit_message>
<xml_diff>
--- a/documents/capstone_proposal_final.docx
+++ b/documents/capstone_proposal_final.docx
@@ -1,6 +1,6 @@
 
 <file path=word/document.xml><?xml version="1.0" encoding="utf-8"?>
-<w:document xmlns:wpc="http://schemas.microsoft.com/office/word/2010/wordprocessingCanvas" xmlns:cx="http://schemas.microsoft.com/office/drawing/2014/chartex" xmlns:cx1="http://schemas.microsoft.com/office/drawing/2015/9/8/chartex" xmlns:cx2="http://schemas.microsoft.com/office/drawing/2015/10/21/chartex" xmlns:cx3="http://schemas.microsoft.com/office/drawing/2016/5/9/chartex" xmlns:cx4="http://schemas.microsoft.com/office/drawing/2016/5/10/chartex" xmlns:cx5="http://schemas.microsoft.com/office/drawing/2016/5/11/chartex" xmlns:cx6="http://schemas.microsoft.com/office/drawing/2016/5/12/chartex" xmlns:cx7="http://schemas.microsoft.com/office/drawing/2016/5/13/chartex" xmlns:cx8="http://schemas.microsoft.com/office/drawing/2016/5/14/chartex" xmlns:mc="http://schemas.openxmlformats.org/markup-compatibility/2006" xmlns:aink="http://schemas.microsoft.com/office/drawing/2016/ink" xmlns:am3d="http://schemas.microsoft.com/office/drawing/2017/model3d" xmlns:o="urn:schemas-microsoft-com:office:office" xmlns:oel="http://schemas.microsoft.com/office/2019/extlst" xmlns:r="http://schemas.openxmlformats.org/officeDocument/2006/relationships" xmlns:m="http://schemas.openxmlformats.org/officeDocument/2006/math" xmlns:v="urn:schemas-microsoft-com:vml" xmlns:wp14="http://schemas.microsoft.com/office/word/2010/wordprocessingDrawing" xmlns:wp="http://schemas.openxmlformats.org/drawingml/2006/wordprocessingDrawing" xmlns:w10="urn:schemas-microsoft-com:office:word" xmlns:w="http://schemas.openxmlformats.org/wordprocessingml/2006/main" xmlns:w14="http://schemas.microsoft.com/office/word/2010/wordml" xmlns:w15="http://schemas.microsoft.com/office/word/2012/wordml" xmlns:w16cex="http://schemas.microsoft.com/office/word/2018/wordml/cex" xmlns:w16cid="http://schemas.microsoft.com/office/word/2016/wordml/cid" xmlns:w16="http://schemas.microsoft.com/office/word/2018/wordml" xmlns:w16du="http://schemas.microsoft.com/office/word/2023/wordml/word16du" xmlns:w16sdtdh="http://schemas.microsoft.com/office/word/2020/wordml/sdtdatahash" xmlns:w16se="http://schemas.microsoft.com/office/word/2015/wordml/symex" xmlns:wpg="http://schemas.microsoft.com/office/word/2010/wordprocessingGroup" xmlns:wpi="http://schemas.microsoft.com/office/word/2010/wordprocessingInk" xmlns:wne="http://schemas.microsoft.com/office/word/2006/wordml" xmlns:wps="http://schemas.microsoft.com/office/word/2010/wordprocessingShape" mc:Ignorable="w14 w15 w16se w16cid w16 w16cex w16sdtdh w16du wp14">
+<w:document xmlns:wpc="http://schemas.microsoft.com/office/word/2010/wordprocessingCanvas" xmlns:cx="http://schemas.microsoft.com/office/drawing/2014/chartex" xmlns:cx1="http://schemas.microsoft.com/office/drawing/2015/9/8/chartex" xmlns:cx2="http://schemas.microsoft.com/office/drawing/2015/10/21/chartex" xmlns:cx3="http://schemas.microsoft.com/office/drawing/2016/5/9/chartex" xmlns:cx4="http://schemas.microsoft.com/office/drawing/2016/5/10/chartex" xmlns:cx5="http://schemas.microsoft.com/office/drawing/2016/5/11/chartex" xmlns:cx6="http://schemas.microsoft.com/office/drawing/2016/5/12/chartex" xmlns:cx7="http://schemas.microsoft.com/office/drawing/2016/5/13/chartex" xmlns:cx8="http://schemas.microsoft.com/office/drawing/2016/5/14/chartex" xmlns:mc="http://schemas.openxmlformats.org/markup-compatibility/2006" xmlns:aink="http://schemas.microsoft.com/office/drawing/2016/ink" xmlns:am3d="http://schemas.microsoft.com/office/drawing/2017/model3d" xmlns:o="urn:schemas-microsoft-com:office:office" xmlns:oel="http://schemas.microsoft.com/office/2019/extlst" xmlns:r="http://schemas.openxmlformats.org/officeDocument/2006/relationships" xmlns:m="http://schemas.openxmlformats.org/officeDocument/2006/math" xmlns:v="urn:schemas-microsoft-com:vml" xmlns:wp14="http://schemas.microsoft.com/office/word/2010/wordprocessingDrawing" xmlns:wp="http://schemas.openxmlformats.org/drawingml/2006/wordprocessingDrawing" xmlns:w10="urn:schemas-microsoft-com:office:word" xmlns:w="http://schemas.openxmlformats.org/wordprocessingml/2006/main" xmlns:w14="http://schemas.microsoft.com/office/word/2010/wordml" xmlns:w15="http://schemas.microsoft.com/office/word/2012/wordml" xmlns:w16cex="http://schemas.microsoft.com/office/word/2018/wordml/cex" xmlns:w16cid="http://schemas.microsoft.com/office/word/2016/wordml/cid" xmlns:w16="http://schemas.microsoft.com/office/word/2018/wordml" xmlns:w16du="http://schemas.microsoft.com/office/word/2023/wordml/word16du" xmlns:w16sdtdh="http://schemas.microsoft.com/office/word/2020/wordml/sdtdatahash" xmlns:w16sdtfl="http://schemas.microsoft.com/office/word/2024/wordml/sdtformatlock" xmlns:w16se="http://schemas.microsoft.com/office/word/2015/wordml/symex" xmlns:wpg="http://schemas.microsoft.com/office/word/2010/wordprocessingGroup" xmlns:wpi="http://schemas.microsoft.com/office/word/2010/wordprocessingInk" xmlns:wne="http://schemas.microsoft.com/office/word/2006/wordml" xmlns:wps="http://schemas.microsoft.com/office/word/2010/wordprocessingShape" mc:Ignorable="w14 w15 w16se w16cid w16 w16cex w16sdtdh w16sdtfl w16du wp14">
   <w:body>
     <w:p>
       <w:pPr>
@@ -9,8 +9,8 @@
           <w:rFonts w:ascii="Verdana" w:eastAsia="Verdana" w:hAnsi="Verdana" w:cs="Verdana"/>
           <w:b/>
           <w:color w:val="538135"/>
-          <w:sz w:val="38"/>
-          <w:szCs w:val="38"/>
+          <w:sz w:val="32"/>
+          <w:szCs w:val="32"/>
         </w:rPr>
       </w:pPr>
       <w:r>
@@ -18,8 +18,8 @@
           <w:rFonts w:ascii="Verdana" w:eastAsia="Verdana" w:hAnsi="Verdana" w:cs="Verdana"/>
           <w:b/>
           <w:color w:val="538135"/>
-          <w:sz w:val="38"/>
-          <w:szCs w:val="38"/>
+          <w:sz w:val="32"/>
+          <w:szCs w:val="32"/>
         </w:rPr>
         <w:t>Executive Summary</w:t>
       </w:r>
@@ -27,21 +27,262 @@
     <w:p>
       <w:pPr>
         <w:shd w:val="clear" w:color="auto" w:fill="FFFFFF"/>
-        <w:spacing w:after="402"/>
-        <w:rPr>
-          <w:rFonts w:ascii="Georgia" w:eastAsia="Georgia" w:hAnsi="Georgia" w:cs="Georgia"/>
-          <w:i/>
-          <w:color w:val="010101"/>
-        </w:rPr>
-      </w:pPr>
-      <w:r>
-        <w:rPr>
-          <w:rFonts w:ascii="Georgia" w:eastAsia="Georgia" w:hAnsi="Georgia" w:cs="Georgia"/>
-          <w:i/>
-          <w:color w:val="010101"/>
-        </w:rPr>
-        <w:t>This section provides an overview to the project. It should briefly touch on the motivation, data question, data to be used, along with any known assumptions and challenges.</w:t>
-      </w:r>
+        <w:rPr>
+          <w:rFonts w:ascii="Georgia" w:eastAsia="Georgia" w:hAnsi="Georgia" w:cs="Georgia"/>
+          <w:color w:val="010101"/>
+          <w:sz w:val="22"/>
+          <w:szCs w:val="22"/>
+        </w:rPr>
+      </w:pPr>
+      <w:r>
+        <w:rPr>
+          <w:rFonts w:ascii="Georgia" w:eastAsia="Georgia" w:hAnsi="Georgia" w:cs="Georgia"/>
+          <w:color w:val="010101"/>
+          <w:sz w:val="22"/>
+          <w:szCs w:val="22"/>
+        </w:rPr>
+        <w:t xml:space="preserve">This project will analyze </w:t>
+      </w:r>
+      <w:r>
+        <w:rPr>
+          <w:rFonts w:ascii="Georgia" w:eastAsia="Georgia" w:hAnsi="Georgia" w:cs="Georgia"/>
+          <w:color w:val="010101"/>
+          <w:sz w:val="22"/>
+          <w:szCs w:val="22"/>
+        </w:rPr>
+        <w:t>the return on investment (ROI) o</w:t>
+      </w:r>
+      <w:r>
+        <w:rPr>
+          <w:rFonts w:ascii="Georgia" w:eastAsia="Georgia" w:hAnsi="Georgia" w:cs="Georgia"/>
+          <w:color w:val="010101"/>
+          <w:sz w:val="22"/>
+          <w:szCs w:val="22"/>
+        </w:rPr>
+        <w:t>f</w:t>
+      </w:r>
+      <w:r>
+        <w:rPr>
+          <w:rFonts w:ascii="Georgia" w:eastAsia="Georgia" w:hAnsi="Georgia" w:cs="Georgia"/>
+          <w:color w:val="010101"/>
+          <w:sz w:val="22"/>
+          <w:szCs w:val="22"/>
+        </w:rPr>
+        <w:t xml:space="preserve"> </w:t>
+      </w:r>
+      <w:r>
+        <w:rPr>
+          <w:rFonts w:ascii="Georgia" w:eastAsia="Georgia" w:hAnsi="Georgia" w:cs="Georgia"/>
+          <w:color w:val="010101"/>
+          <w:sz w:val="22"/>
+          <w:szCs w:val="22"/>
+        </w:rPr>
+        <w:t>different postsecondary degree types—</w:t>
+      </w:r>
+      <w:r>
+        <w:rPr>
+          <w:rFonts w:ascii="Georgia" w:eastAsia="Georgia" w:hAnsi="Georgia" w:cs="Georgia"/>
+          <w:color w:val="010101"/>
+          <w:sz w:val="22"/>
+          <w:szCs w:val="22"/>
+        </w:rPr>
+        <w:t xml:space="preserve">short </w:t>
+      </w:r>
+      <w:r>
+        <w:rPr>
+          <w:rFonts w:ascii="Georgia" w:eastAsia="Georgia" w:hAnsi="Georgia" w:cs="Georgia"/>
+          <w:color w:val="010101"/>
+          <w:sz w:val="22"/>
+          <w:szCs w:val="22"/>
+        </w:rPr>
+        <w:t>certificate programs</w:t>
+      </w:r>
+      <w:r>
+        <w:rPr>
+          <w:rFonts w:ascii="Georgia" w:eastAsia="Georgia" w:hAnsi="Georgia" w:cs="Georgia"/>
+          <w:color w:val="010101"/>
+          <w:sz w:val="22"/>
+          <w:szCs w:val="22"/>
+        </w:rPr>
+        <w:t xml:space="preserve"> (</w:t>
+      </w:r>
+      <w:r>
+        <w:rPr>
+          <w:rFonts w:ascii="Georgia" w:eastAsia="Georgia" w:hAnsi="Georgia" w:cs="Georgia"/>
+          <w:color w:val="010101"/>
+          <w:sz w:val="22"/>
+          <w:szCs w:val="22"/>
+        </w:rPr>
+        <w:t>&lt;6 months)</w:t>
+      </w:r>
+      <w:r>
+        <w:rPr>
+          <w:rFonts w:ascii="Georgia" w:eastAsia="Georgia" w:hAnsi="Georgia" w:cs="Georgia"/>
+          <w:color w:val="010101"/>
+          <w:sz w:val="22"/>
+          <w:szCs w:val="22"/>
+        </w:rPr>
+        <w:t>,</w:t>
+      </w:r>
+      <w:r>
+        <w:rPr>
+          <w:rFonts w:ascii="Georgia" w:eastAsia="Georgia" w:hAnsi="Georgia" w:cs="Georgia"/>
+          <w:color w:val="010101"/>
+          <w:sz w:val="22"/>
+          <w:szCs w:val="22"/>
+        </w:rPr>
+        <w:t xml:space="preserve"> long certificate programs (&gt;6 months),</w:t>
+      </w:r>
+      <w:r>
+        <w:rPr>
+          <w:rFonts w:ascii="Georgia" w:eastAsia="Georgia" w:hAnsi="Georgia" w:cs="Georgia"/>
+          <w:color w:val="010101"/>
+          <w:sz w:val="22"/>
+          <w:szCs w:val="22"/>
+        </w:rPr>
+        <w:t xml:space="preserve"> associates degrees, and bachelor’s degrees</w:t>
+      </w:r>
+      <w:r>
+        <w:rPr>
+          <w:rFonts w:ascii="Georgia" w:eastAsia="Georgia" w:hAnsi="Georgia" w:cs="Georgia"/>
+          <w:color w:val="010101"/>
+          <w:sz w:val="22"/>
+          <w:szCs w:val="22"/>
+        </w:rPr>
+        <w:t xml:space="preserve"> </w:t>
+      </w:r>
+      <w:r>
+        <w:rPr>
+          <w:rFonts w:ascii="Georgia" w:eastAsia="Georgia" w:hAnsi="Georgia" w:cs="Georgia"/>
+          <w:color w:val="010101"/>
+          <w:sz w:val="22"/>
+          <w:szCs w:val="22"/>
+        </w:rPr>
+        <w:t>in the state of Tennessee. ROI will be earnings-based</w:t>
+      </w:r>
+      <w:r>
+        <w:rPr>
+          <w:rFonts w:ascii="Georgia" w:eastAsia="Georgia" w:hAnsi="Georgia" w:cs="Georgia"/>
+          <w:color w:val="010101"/>
+          <w:sz w:val="22"/>
+          <w:szCs w:val="22"/>
+        </w:rPr>
+        <w:t xml:space="preserve"> and will focus on selected fields of study</w:t>
+      </w:r>
+      <w:r>
+        <w:rPr>
+          <w:rFonts w:ascii="Georgia" w:eastAsia="Georgia" w:hAnsi="Georgia" w:cs="Georgia"/>
+          <w:color w:val="010101"/>
+          <w:sz w:val="22"/>
+          <w:szCs w:val="22"/>
+        </w:rPr>
+        <w:t xml:space="preserve"> (Computer and Information Sciences, Health Professions, and Mechanical/Repair Technologies).</w:t>
+      </w:r>
+      <w:r>
+        <w:rPr>
+          <w:rFonts w:ascii="Georgia" w:eastAsia="Georgia" w:hAnsi="Georgia" w:cs="Georgia"/>
+          <w:color w:val="010101"/>
+          <w:sz w:val="22"/>
+          <w:szCs w:val="22"/>
+        </w:rPr>
+        <w:t xml:space="preserve"> The goal is to provide a data-driven perspective on how degree types relate to labor-market outcomes</w:t>
+      </w:r>
+      <w:r>
+        <w:rPr>
+          <w:rFonts w:ascii="Georgia" w:eastAsia="Georgia" w:hAnsi="Georgia" w:cs="Georgia"/>
+          <w:color w:val="010101"/>
+          <w:sz w:val="22"/>
+          <w:szCs w:val="22"/>
+        </w:rPr>
+        <w:t xml:space="preserve"> over time. Two years</w:t>
+      </w:r>
+      <w:r>
+        <w:rPr>
+          <w:rFonts w:ascii="Georgia" w:eastAsia="Georgia" w:hAnsi="Georgia" w:cs="Georgia"/>
+          <w:color w:val="010101"/>
+          <w:sz w:val="22"/>
+          <w:szCs w:val="22"/>
+        </w:rPr>
+        <w:t>, 2011 and 2021,</w:t>
+      </w:r>
+      <w:r>
+        <w:rPr>
+          <w:rFonts w:ascii="Georgia" w:eastAsia="Georgia" w:hAnsi="Georgia" w:cs="Georgia"/>
+          <w:color w:val="010101"/>
+          <w:sz w:val="22"/>
+          <w:szCs w:val="22"/>
+        </w:rPr>
+        <w:t xml:space="preserve"> have been selected for comparison based on available data</w:t>
+      </w:r>
+      <w:r>
+        <w:rPr>
+          <w:rFonts w:ascii="Georgia" w:eastAsia="Georgia" w:hAnsi="Georgia" w:cs="Georgia"/>
+          <w:color w:val="010101"/>
+          <w:sz w:val="22"/>
+          <w:szCs w:val="22"/>
+        </w:rPr>
+        <w:t xml:space="preserve"> recent events</w:t>
+      </w:r>
+      <w:r>
+        <w:rPr>
+          <w:rFonts w:ascii="Georgia" w:eastAsia="Georgia" w:hAnsi="Georgia" w:cs="Georgia"/>
+          <w:color w:val="010101"/>
+          <w:sz w:val="22"/>
+          <w:szCs w:val="22"/>
+        </w:rPr>
+        <w:t>.</w:t>
+      </w:r>
+      <w:r>
+        <w:rPr>
+          <w:rFonts w:ascii="Georgia" w:eastAsia="Georgia" w:hAnsi="Georgia" w:cs="Georgia"/>
+          <w:color w:val="010101"/>
+          <w:sz w:val="22"/>
+          <w:szCs w:val="22"/>
+        </w:rPr>
+        <w:t xml:space="preserve"> </w:t>
+      </w:r>
+    </w:p>
+    <w:p>
+      <w:pPr>
+        <w:shd w:val="clear" w:color="auto" w:fill="FFFFFF"/>
+        <w:rPr>
+          <w:rFonts w:ascii="Georgia" w:eastAsia="Georgia" w:hAnsi="Georgia" w:cs="Georgia"/>
+          <w:color w:val="010101"/>
+          <w:sz w:val="22"/>
+          <w:szCs w:val="22"/>
+        </w:rPr>
+      </w:pPr>
+    </w:p>
+    <w:p>
+      <w:pPr>
+        <w:shd w:val="clear" w:color="auto" w:fill="FFFFFF"/>
+        <w:rPr>
+          <w:rFonts w:ascii="Georgia" w:eastAsia="Georgia" w:hAnsi="Georgia" w:cs="Georgia"/>
+          <w:color w:val="010101"/>
+          <w:sz w:val="22"/>
+          <w:szCs w:val="22"/>
+        </w:rPr>
+      </w:pPr>
+      <w:r>
+        <w:rPr>
+          <w:rFonts w:ascii="Georgia" w:eastAsia="Georgia" w:hAnsi="Georgia" w:cs="Georgia"/>
+          <w:color w:val="010101"/>
+          <w:sz w:val="22"/>
+          <w:szCs w:val="22"/>
+        </w:rPr>
+        <w:t>This analysis is limited to degree-granting and credit-bearing certificate programs reported to IPEDS. Many short-term workforce and nonprofit training programs are not included, despite their potential labor-market value.</w:t>
+      </w:r>
+    </w:p>
+    <w:p>
+      <w:pPr>
+        <w:shd w:val="clear" w:color="auto" w:fill="FFFFFF"/>
+        <w:rPr>
+          <w:rFonts w:ascii="Georgia" w:eastAsia="Georgia" w:hAnsi="Georgia" w:cs="Georgia"/>
+          <w:color w:val="010101"/>
+          <w:sz w:val="22"/>
+          <w:szCs w:val="22"/>
+        </w:rPr>
+      </w:pPr>
     </w:p>
     <w:p>
       <w:pPr>
@@ -50,8 +291,8 @@
           <w:rFonts w:ascii="Verdana" w:eastAsia="Verdana" w:hAnsi="Verdana" w:cs="Verdana"/>
           <w:b/>
           <w:color w:val="538135"/>
-          <w:sz w:val="38"/>
-          <w:szCs w:val="38"/>
+          <w:sz w:val="32"/>
+          <w:szCs w:val="32"/>
         </w:rPr>
       </w:pPr>
       <w:r>
@@ -59,8 +300,8 @@
           <w:rFonts w:ascii="Verdana" w:eastAsia="Verdana" w:hAnsi="Verdana" w:cs="Verdana"/>
           <w:b/>
           <w:color w:val="538135"/>
-          <w:sz w:val="38"/>
-          <w:szCs w:val="38"/>
+          <w:sz w:val="32"/>
+          <w:szCs w:val="32"/>
         </w:rPr>
         <w:t>Motivation</w:t>
       </w:r>
@@ -68,21 +309,159 @@
     <w:p>
       <w:pPr>
         <w:shd w:val="clear" w:color="auto" w:fill="FFFFFF"/>
-        <w:spacing w:after="402"/>
-        <w:rPr>
-          <w:rFonts w:ascii="Georgia" w:eastAsia="Georgia" w:hAnsi="Georgia" w:cs="Georgia"/>
-          <w:i/>
-          <w:color w:val="010101"/>
-        </w:rPr>
-      </w:pPr>
-      <w:r>
-        <w:rPr>
-          <w:rFonts w:ascii="Georgia" w:eastAsia="Georgia" w:hAnsi="Georgia" w:cs="Georgia"/>
-          <w:i/>
-          <w:color w:val="010101"/>
-        </w:rPr>
-        <w:t>Here you will go into more detail about why you have chosen this project.</w:t>
-      </w:r>
+        <w:rPr>
+          <w:rFonts w:ascii="Georgia" w:eastAsia="Georgia" w:hAnsi="Georgia" w:cs="Georgia"/>
+          <w:color w:val="010101"/>
+          <w:sz w:val="22"/>
+          <w:szCs w:val="22"/>
+        </w:rPr>
+      </w:pPr>
+      <w:r>
+        <w:rPr>
+          <w:rFonts w:ascii="Georgia" w:eastAsia="Georgia" w:hAnsi="Georgia" w:cs="Georgia"/>
+          <w:color w:val="010101"/>
+          <w:sz w:val="22"/>
+          <w:szCs w:val="22"/>
+        </w:rPr>
+        <w:t xml:space="preserve">Several factors contributed to my interest in this project. </w:t>
+      </w:r>
+      <w:r>
+        <w:rPr>
+          <w:rFonts w:ascii="Georgia" w:eastAsia="Georgia" w:hAnsi="Georgia" w:cs="Georgia"/>
+          <w:color w:val="010101"/>
+          <w:sz w:val="22"/>
+          <w:szCs w:val="22"/>
+        </w:rPr>
+        <w:t xml:space="preserve">I have read a lot about the disproportionate rise in the cost of a college education compared to </w:t>
+      </w:r>
+      <w:r>
+        <w:rPr>
+          <w:rFonts w:ascii="Georgia" w:eastAsia="Georgia" w:hAnsi="Georgia" w:cs="Georgia"/>
+          <w:color w:val="010101"/>
+          <w:sz w:val="22"/>
+          <w:szCs w:val="22"/>
+        </w:rPr>
+        <w:t xml:space="preserve">relative stagnation </w:t>
+      </w:r>
+      <w:r>
+        <w:rPr>
+          <w:rFonts w:ascii="Georgia" w:eastAsia="Georgia" w:hAnsi="Georgia" w:cs="Georgia"/>
+          <w:color w:val="010101"/>
+          <w:sz w:val="22"/>
+          <w:szCs w:val="22"/>
+        </w:rPr>
+        <w:t>in</w:t>
+      </w:r>
+      <w:r>
+        <w:rPr>
+          <w:rFonts w:ascii="Georgia" w:eastAsia="Georgia" w:hAnsi="Georgia" w:cs="Georgia"/>
+          <w:color w:val="010101"/>
+          <w:sz w:val="22"/>
+          <w:szCs w:val="22"/>
+        </w:rPr>
+        <w:t xml:space="preserve"> wages and I wanted to explore the actual data to discover for myself</w:t>
+      </w:r>
+      <w:r>
+        <w:rPr>
+          <w:rFonts w:ascii="Georgia" w:eastAsia="Georgia" w:hAnsi="Georgia" w:cs="Georgia"/>
+          <w:color w:val="010101"/>
+          <w:sz w:val="22"/>
+          <w:szCs w:val="22"/>
+        </w:rPr>
+        <w:t xml:space="preserve"> </w:t>
+      </w:r>
+      <w:r>
+        <w:rPr>
+          <w:rFonts w:ascii="Georgia" w:eastAsia="Georgia" w:hAnsi="Georgia" w:cs="Georgia"/>
+          <w:color w:val="010101"/>
+          <w:sz w:val="22"/>
+          <w:szCs w:val="22"/>
+        </w:rPr>
+        <w:t xml:space="preserve">if </w:t>
+      </w:r>
+      <w:r>
+        <w:rPr>
+          <w:rFonts w:ascii="Georgia" w:eastAsia="Georgia" w:hAnsi="Georgia" w:cs="Georgia"/>
+          <w:color w:val="010101"/>
+          <w:sz w:val="22"/>
+          <w:szCs w:val="22"/>
+        </w:rPr>
+        <w:t>a bachelor’s degree is still worth the investment</w:t>
+      </w:r>
+      <w:r>
+        <w:rPr>
+          <w:rFonts w:ascii="Georgia" w:eastAsia="Georgia" w:hAnsi="Georgia" w:cs="Georgia"/>
+          <w:color w:val="010101"/>
+          <w:sz w:val="22"/>
+          <w:szCs w:val="22"/>
+        </w:rPr>
+        <w:t xml:space="preserve">. After a 15-year career in manufacturing </w:t>
+      </w:r>
+      <w:r>
+        <w:rPr>
+          <w:rFonts w:ascii="Georgia" w:eastAsia="Georgia" w:hAnsi="Georgia" w:cs="Georgia"/>
+          <w:color w:val="010101"/>
+          <w:sz w:val="22"/>
+          <w:szCs w:val="22"/>
+        </w:rPr>
+        <w:t xml:space="preserve">suddenly ended, I was forced to reassess my </w:t>
+      </w:r>
+      <w:r>
+        <w:rPr>
+          <w:rFonts w:ascii="Georgia" w:eastAsia="Georgia" w:hAnsi="Georgia" w:cs="Georgia"/>
+          <w:color w:val="010101"/>
+          <w:sz w:val="22"/>
+          <w:szCs w:val="22"/>
+        </w:rPr>
+        <w:t xml:space="preserve">future career options and choose a path that would provide me with the </w:t>
+      </w:r>
+      <w:r>
+        <w:rPr>
+          <w:rFonts w:ascii="Georgia" w:eastAsia="Georgia" w:hAnsi="Georgia" w:cs="Georgia"/>
+          <w:color w:val="010101"/>
+          <w:sz w:val="22"/>
+          <w:szCs w:val="22"/>
+        </w:rPr>
+        <w:t xml:space="preserve">greatest opportunities. </w:t>
+      </w:r>
+      <w:r>
+        <w:rPr>
+          <w:rFonts w:ascii="Georgia" w:eastAsia="Georgia" w:hAnsi="Georgia" w:cs="Georgia"/>
+          <w:color w:val="010101"/>
+          <w:sz w:val="22"/>
+          <w:szCs w:val="22"/>
+        </w:rPr>
+        <w:t xml:space="preserve">Additionally, I have two college-age children who are </w:t>
+      </w:r>
+      <w:r>
+        <w:rPr>
+          <w:rFonts w:ascii="Georgia" w:eastAsia="Georgia" w:hAnsi="Georgia" w:cs="Georgia"/>
+          <w:color w:val="010101"/>
+          <w:sz w:val="22"/>
+          <w:szCs w:val="22"/>
+        </w:rPr>
+        <w:t>making education and career choices.</w:t>
+      </w:r>
+      <w:r>
+        <w:rPr>
+          <w:rFonts w:ascii="Georgia" w:eastAsia="Georgia" w:hAnsi="Georgia" w:cs="Georgia"/>
+          <w:color w:val="010101"/>
+          <w:sz w:val="22"/>
+          <w:szCs w:val="22"/>
+        </w:rPr>
+        <w:t xml:space="preserve"> </w:t>
+      </w:r>
+    </w:p>
+    <w:p>
+      <w:pPr>
+        <w:shd w:val="clear" w:color="auto" w:fill="FFFFFF"/>
+        <w:rPr>
+          <w:rFonts w:ascii="Georgia" w:eastAsia="Georgia" w:hAnsi="Georgia" w:cs="Georgia"/>
+          <w:color w:val="010101"/>
+          <w:sz w:val="22"/>
+          <w:szCs w:val="22"/>
+        </w:rPr>
+      </w:pPr>
     </w:p>
     <w:p>
       <w:pPr>
@@ -91,8 +470,8 @@
           <w:rFonts w:ascii="Verdana" w:eastAsia="Verdana" w:hAnsi="Verdana" w:cs="Verdana"/>
           <w:b/>
           <w:color w:val="538135"/>
-          <w:sz w:val="38"/>
-          <w:szCs w:val="38"/>
+          <w:sz w:val="32"/>
+          <w:szCs w:val="32"/>
         </w:rPr>
       </w:pPr>
       <w:r>
@@ -100,8 +479,8 @@
           <w:rFonts w:ascii="Verdana" w:eastAsia="Verdana" w:hAnsi="Verdana" w:cs="Verdana"/>
           <w:b/>
           <w:color w:val="538135"/>
-          <w:sz w:val="38"/>
-          <w:szCs w:val="38"/>
+          <w:sz w:val="32"/>
+          <w:szCs w:val="32"/>
         </w:rPr>
         <w:t>Data Question</w:t>
       </w:r>
@@ -112,16 +491,227 @@
         <w:rPr>
           <w:rFonts w:ascii="Georgia" w:eastAsia="Georgia" w:hAnsi="Georgia" w:cs="Georgia"/>
           <w:color w:val="010101"/>
-        </w:rPr>
-      </w:pPr>
-      <w:r>
-        <w:rPr>
-          <w:rFonts w:ascii="Georgia" w:eastAsia="Georgia" w:hAnsi="Georgia" w:cs="Georgia"/>
-          <w:i/>
-          <w:color w:val="000000"/>
-        </w:rPr>
-        <w:t>Present your question. Feel free to include any research/articles that are relevant or show where others have attempted to answer this question.</w:t>
-      </w:r>
+          <w:sz w:val="22"/>
+          <w:szCs w:val="22"/>
+        </w:rPr>
+      </w:pPr>
+      <w:r>
+        <w:rPr>
+          <w:rFonts w:ascii="Georgia" w:eastAsia="Georgia" w:hAnsi="Georgia" w:cs="Georgia"/>
+          <w:color w:val="010101"/>
+          <w:sz w:val="22"/>
+          <w:szCs w:val="22"/>
+        </w:rPr>
+        <w:t>How do early career e</w:t>
+      </w:r>
+      <w:r>
+        <w:rPr>
+          <w:rFonts w:ascii="Georgia" w:eastAsia="Georgia" w:hAnsi="Georgia" w:cs="Georgia"/>
+          <w:color w:val="010101"/>
+          <w:sz w:val="22"/>
+          <w:szCs w:val="22"/>
+        </w:rPr>
+        <w:t xml:space="preserve">arnings differ by degree type (certificate, associate, bachelor’s) in </w:t>
+      </w:r>
+      <w:r>
+        <w:rPr>
+          <w:rFonts w:ascii="Georgia" w:eastAsia="Georgia" w:hAnsi="Georgia" w:cs="Georgia"/>
+          <w:color w:val="010101"/>
+          <w:sz w:val="22"/>
+          <w:szCs w:val="22"/>
+        </w:rPr>
+        <w:t>Tennesse</w:t>
+      </w:r>
+      <w:r>
+        <w:rPr>
+          <w:rFonts w:ascii="Georgia" w:eastAsia="Georgia" w:hAnsi="Georgia" w:cs="Georgia"/>
+          <w:color w:val="010101"/>
+          <w:sz w:val="22"/>
+          <w:szCs w:val="22"/>
+        </w:rPr>
+        <w:t xml:space="preserve">e: A </w:t>
+      </w:r>
+      <w:r>
+        <w:rPr>
+          <w:rFonts w:ascii="Georgia" w:eastAsia="Georgia" w:hAnsi="Georgia" w:cs="Georgia"/>
+          <w:color w:val="010101"/>
+          <w:sz w:val="22"/>
+          <w:szCs w:val="22"/>
+        </w:rPr>
+        <w:t>comparison of</w:t>
+      </w:r>
+      <w:r>
+        <w:rPr>
+          <w:rFonts w:ascii="Georgia" w:eastAsia="Georgia" w:hAnsi="Georgia" w:cs="Georgia"/>
+          <w:color w:val="010101"/>
+          <w:sz w:val="22"/>
+          <w:szCs w:val="22"/>
+        </w:rPr>
+        <w:t xml:space="preserve"> cost and </w:t>
+      </w:r>
+      <w:r>
+        <w:rPr>
+          <w:rFonts w:ascii="Georgia" w:eastAsia="Georgia" w:hAnsi="Georgia" w:cs="Georgia"/>
+          <w:color w:val="010101"/>
+          <w:sz w:val="22"/>
+          <w:szCs w:val="22"/>
+        </w:rPr>
+        <w:t>earnings for</w:t>
+      </w:r>
+      <w:r>
+        <w:rPr>
+          <w:rFonts w:ascii="Georgia" w:eastAsia="Georgia" w:hAnsi="Georgia" w:cs="Georgia"/>
+          <w:color w:val="010101"/>
+          <w:sz w:val="22"/>
+          <w:szCs w:val="22"/>
+        </w:rPr>
+        <w:t xml:space="preserve"> three selected fields in </w:t>
+      </w:r>
+      <w:r>
+        <w:rPr>
+          <w:rFonts w:ascii="Georgia" w:eastAsia="Georgia" w:hAnsi="Georgia" w:cs="Georgia"/>
+          <w:color w:val="010101"/>
+          <w:sz w:val="22"/>
+          <w:szCs w:val="22"/>
+        </w:rPr>
+        <w:t>2011 and 2021.</w:t>
+      </w:r>
+    </w:p>
+    <w:p>
+      <w:pPr>
+        <w:shd w:val="clear" w:color="auto" w:fill="FFFFFF"/>
+        <w:rPr>
+          <w:rFonts w:ascii="Georgia" w:eastAsia="Georgia" w:hAnsi="Georgia" w:cs="Georgia"/>
+          <w:color w:val="010101"/>
+          <w:sz w:val="22"/>
+          <w:szCs w:val="22"/>
+        </w:rPr>
+      </w:pPr>
+    </w:p>
+    <w:p>
+      <w:pPr>
+        <w:shd w:val="clear" w:color="auto" w:fill="FFFFFF"/>
+        <w:rPr>
+          <w:rFonts w:ascii="Georgia" w:eastAsia="Georgia" w:hAnsi="Georgia" w:cs="Georgia"/>
+          <w:color w:val="010101"/>
+          <w:sz w:val="22"/>
+          <w:szCs w:val="22"/>
+        </w:rPr>
+      </w:pPr>
+      <w:r>
+        <w:rPr>
+          <w:rFonts w:ascii="Georgia" w:eastAsia="Georgia" w:hAnsi="Georgia" w:cs="Georgia"/>
+          <w:color w:val="010101"/>
+          <w:sz w:val="22"/>
+          <w:szCs w:val="22"/>
+        </w:rPr>
+        <w:t>Some articles:</w:t>
+      </w:r>
+    </w:p>
+    <w:p>
+      <w:pPr>
+        <w:shd w:val="clear" w:color="auto" w:fill="FFFFFF"/>
+        <w:rPr>
+          <w:rFonts w:ascii="Georgia" w:eastAsia="Georgia" w:hAnsi="Georgia" w:cs="Georgia"/>
+          <w:color w:val="010101"/>
+          <w:sz w:val="22"/>
+          <w:szCs w:val="22"/>
+        </w:rPr>
+      </w:pPr>
+      <w:r>
+        <w:rPr>
+          <w:rFonts w:ascii="Georgia" w:eastAsia="Georgia" w:hAnsi="Georgia" w:cs="Georgia"/>
+          <w:color w:val="010101"/>
+          <w:sz w:val="22"/>
+          <w:szCs w:val="22"/>
+        </w:rPr>
+        <w:t xml:space="preserve">Business Insider: </w:t>
+      </w:r>
+      <w:hyperlink r:id="rId6" w:history="1">
+        <w:r>
+          <w:rPr>
+            <w:rStyle w:val="Hyperlink"/>
+            <w:rFonts w:ascii="Georgia" w:eastAsia="Georgia" w:hAnsi="Georgia" w:cs="Georgia"/>
+            <w:sz w:val="22"/>
+            <w:szCs w:val="22"/>
+          </w:rPr>
+          <w:t>Is College Worth It? a Cost-Benefit Analysis of College in 2025</w:t>
+        </w:r>
+      </w:hyperlink>
+    </w:p>
+    <w:p>
+      <w:pPr>
+        <w:shd w:val="clear" w:color="auto" w:fill="FFFFFF"/>
+        <w:rPr>
+          <w:rFonts w:ascii="Georgia" w:eastAsia="Georgia" w:hAnsi="Georgia" w:cs="Georgia"/>
+          <w:color w:val="010101"/>
+          <w:sz w:val="22"/>
+          <w:szCs w:val="22"/>
+        </w:rPr>
+      </w:pPr>
+      <w:r>
+        <w:rPr>
+          <w:rFonts w:ascii="Georgia" w:eastAsia="Georgia" w:hAnsi="Georgia" w:cs="Georgia"/>
+          <w:color w:val="010101"/>
+          <w:sz w:val="22"/>
+          <w:szCs w:val="22"/>
+        </w:rPr>
+        <w:t xml:space="preserve">Forbes: </w:t>
+      </w:r>
+      <w:hyperlink r:id="rId7" w:history="1">
+        <w:r>
+          <w:rPr>
+            <w:rStyle w:val="Hyperlink"/>
+            <w:rFonts w:ascii="Georgia" w:eastAsia="Georgia" w:hAnsi="Georgia" w:cs="Georgia"/>
+            <w:sz w:val="22"/>
+            <w:szCs w:val="22"/>
+          </w:rPr>
+          <w:t>Many College Degrees Are Now Useless—Here’s What Is Worth Your Money</w:t>
+        </w:r>
+      </w:hyperlink>
+    </w:p>
+    <w:p>
+      <w:pPr>
+        <w:shd w:val="clear" w:color="auto" w:fill="FFFFFF"/>
+        <w:rPr>
+          <w:rFonts w:ascii="Georgia" w:eastAsia="Georgia" w:hAnsi="Georgia" w:cs="Georgia"/>
+          <w:color w:val="010101"/>
+          <w:sz w:val="22"/>
+          <w:szCs w:val="22"/>
+        </w:rPr>
+      </w:pPr>
+      <w:r>
+        <w:rPr>
+          <w:rFonts w:ascii="Georgia" w:eastAsia="Georgia" w:hAnsi="Georgia" w:cs="Georgia"/>
+          <w:color w:val="010101"/>
+          <w:sz w:val="22"/>
+          <w:szCs w:val="22"/>
+        </w:rPr>
+        <w:t xml:space="preserve">MSN: </w:t>
+      </w:r>
+      <w:hyperlink r:id="rId8" w:history="1">
+        <w:r>
+          <w:rPr>
+            <w:rStyle w:val="Hyperlink"/>
+            <w:rFonts w:ascii="Georgia" w:eastAsia="Georgia" w:hAnsi="Georgia" w:cs="Georgia"/>
+            <w:sz w:val="22"/>
+            <w:szCs w:val="22"/>
+          </w:rPr>
+          <w:t>Is a college degree still worth It? 25% of graduates in the U.S. question its value</w:t>
+        </w:r>
+      </w:hyperlink>
+    </w:p>
+    <w:p>
+      <w:pPr>
+        <w:shd w:val="clear" w:color="auto" w:fill="FFFFFF"/>
+        <w:rPr>
+          <w:rFonts w:ascii="Georgia" w:eastAsia="Verdana" w:hAnsi="Georgia" w:cs="Verdana"/>
+          <w:b/>
+          <w:color w:val="538135"/>
+          <w:sz w:val="22"/>
+          <w:szCs w:val="22"/>
+        </w:rPr>
+      </w:pPr>
     </w:p>
     <w:p>
       <w:pPr>
@@ -130,81 +720,458 @@
           <w:rFonts w:ascii="Verdana" w:eastAsia="Verdana" w:hAnsi="Verdana" w:cs="Verdana"/>
           <w:b/>
           <w:color w:val="538135"/>
-          <w:sz w:val="38"/>
-          <w:szCs w:val="38"/>
-        </w:rPr>
-      </w:pPr>
-    </w:p>
-    <w:p>
-      <w:pPr>
-        <w:shd w:val="clear" w:color="auto" w:fill="FFFFFF"/>
+          <w:sz w:val="32"/>
+          <w:szCs w:val="32"/>
+        </w:rPr>
+      </w:pPr>
+      <w:r>
         <w:rPr>
           <w:rFonts w:ascii="Verdana" w:eastAsia="Verdana" w:hAnsi="Verdana" w:cs="Verdana"/>
           <w:b/>
           <w:color w:val="538135"/>
-          <w:sz w:val="38"/>
-          <w:szCs w:val="38"/>
-        </w:rPr>
-      </w:pPr>
-      <w:r>
+          <w:sz w:val="32"/>
+          <w:szCs w:val="32"/>
+        </w:rPr>
+        <w:t>Minimum Viable Product (MVP)</w:t>
+      </w:r>
+    </w:p>
+    <w:p>
+      <w:pPr>
+        <w:shd w:val="clear" w:color="auto" w:fill="FFFFFF"/>
+        <w:rPr>
+          <w:rFonts w:ascii="Georgia" w:eastAsia="Georgia" w:hAnsi="Georgia" w:cs="Georgia"/>
+          <w:sz w:val="22"/>
+          <w:szCs w:val="22"/>
+        </w:rPr>
+      </w:pPr>
+      <w:r>
+        <w:rPr>
+          <w:rFonts w:ascii="Georgia" w:eastAsia="Georgia" w:hAnsi="Georgia" w:cs="Georgia"/>
+          <w:sz w:val="22"/>
+          <w:szCs w:val="22"/>
+        </w:rPr>
+        <w:t xml:space="preserve">The </w:t>
+      </w:r>
+      <w:r>
+        <w:rPr>
+          <w:rFonts w:ascii="Georgia" w:eastAsia="Georgia" w:hAnsi="Georgia" w:cs="Georgia"/>
+          <w:sz w:val="22"/>
+          <w:szCs w:val="22"/>
+        </w:rPr>
+        <w:t>project will consist of</w:t>
+      </w:r>
+      <w:r>
+        <w:rPr>
+          <w:rFonts w:ascii="Georgia" w:eastAsia="Georgia" w:hAnsi="Georgia" w:cs="Georgia"/>
+          <w:sz w:val="22"/>
+          <w:szCs w:val="22"/>
+        </w:rPr>
+        <w:t xml:space="preserve">: </w:t>
+      </w:r>
+    </w:p>
+    <w:p>
+      <w:pPr>
+        <w:pStyle w:val="ListParagraph"/>
+        <w:numPr>
+          <w:ilvl w:val="0"/>
+          <w:numId w:val="4"/>
+        </w:numPr>
+        <w:shd w:val="clear" w:color="auto" w:fill="FFFFFF"/>
+        <w:rPr>
+          <w:rFonts w:ascii="Georgia" w:eastAsia="Georgia" w:hAnsi="Georgia" w:cs="Georgia"/>
+          <w:sz w:val="22"/>
+          <w:szCs w:val="22"/>
+        </w:rPr>
+      </w:pPr>
+      <w:r>
+        <w:rPr>
+          <w:rFonts w:ascii="Georgia" w:eastAsia="Georgia" w:hAnsi="Georgia" w:cs="Georgia"/>
+          <w:sz w:val="22"/>
+          <w:szCs w:val="22"/>
+        </w:rPr>
+        <w:t>A</w:t>
+      </w:r>
+      <w:r>
+        <w:rPr>
+          <w:rFonts w:ascii="Georgia" w:eastAsia="Georgia" w:hAnsi="Georgia" w:cs="Georgia"/>
+          <w:sz w:val="22"/>
+          <w:szCs w:val="22"/>
+        </w:rPr>
+        <w:t xml:space="preserve"> clean dataset combining IPEDS completions data and College Scorecard earnings data</w:t>
+      </w:r>
+    </w:p>
+    <w:p>
+      <w:pPr>
+        <w:pStyle w:val="ListParagraph"/>
+        <w:numPr>
+          <w:ilvl w:val="0"/>
+          <w:numId w:val="4"/>
+        </w:numPr>
+        <w:shd w:val="clear" w:color="auto" w:fill="FFFFFF"/>
+        <w:rPr>
+          <w:rFonts w:ascii="Georgia" w:eastAsia="Georgia" w:hAnsi="Georgia" w:cs="Georgia"/>
+          <w:sz w:val="22"/>
+          <w:szCs w:val="22"/>
+        </w:rPr>
+      </w:pPr>
+      <w:r>
+        <w:rPr>
+          <w:rFonts w:ascii="Georgia" w:eastAsia="Georgia" w:hAnsi="Georgia" w:cs="Georgia"/>
+          <w:sz w:val="22"/>
+          <w:szCs w:val="22"/>
+        </w:rPr>
+        <w:t>A</w:t>
+      </w:r>
+      <w:r>
+        <w:rPr>
+          <w:rFonts w:ascii="Georgia" w:eastAsia="Georgia" w:hAnsi="Georgia" w:cs="Georgia"/>
+          <w:sz w:val="22"/>
+          <w:szCs w:val="22"/>
+        </w:rPr>
+        <w:t xml:space="preserve"> Power BI dashboard featuring </w:t>
+      </w:r>
+      <w:r>
+        <w:rPr>
+          <w:rFonts w:ascii="Georgia" w:eastAsia="Georgia" w:hAnsi="Georgia" w:cs="Georgia"/>
+          <w:sz w:val="22"/>
+          <w:szCs w:val="22"/>
+        </w:rPr>
+        <w:t xml:space="preserve">median earnings by degree type, comparisons between </w:t>
+      </w:r>
+      <w:r>
+        <w:rPr>
+          <w:rFonts w:ascii="Georgia" w:eastAsia="Georgia" w:hAnsi="Georgia" w:cs="Georgia"/>
+          <w:sz w:val="22"/>
+          <w:szCs w:val="22"/>
+        </w:rPr>
+        <w:t>2011 and 2021</w:t>
+      </w:r>
+    </w:p>
+    <w:p>
+      <w:pPr>
+        <w:pStyle w:val="ListParagraph"/>
+        <w:numPr>
+          <w:ilvl w:val="0"/>
+          <w:numId w:val="4"/>
+        </w:numPr>
+        <w:shd w:val="clear" w:color="auto" w:fill="FFFFFF"/>
+        <w:rPr>
+          <w:rFonts w:ascii="Georgia" w:eastAsia="Georgia" w:hAnsi="Georgia" w:cs="Georgia"/>
+          <w:sz w:val="22"/>
+          <w:szCs w:val="22"/>
+        </w:rPr>
+      </w:pPr>
+      <w:r>
+        <w:rPr>
+          <w:rFonts w:ascii="Georgia" w:eastAsia="Georgia" w:hAnsi="Georgia" w:cs="Georgia"/>
+          <w:sz w:val="22"/>
+          <w:szCs w:val="22"/>
+        </w:rPr>
+        <w:t>F</w:t>
+      </w:r>
+      <w:r>
+        <w:rPr>
+          <w:rFonts w:ascii="Georgia" w:eastAsia="Georgia" w:hAnsi="Georgia" w:cs="Georgia"/>
+          <w:sz w:val="22"/>
+          <w:szCs w:val="22"/>
+        </w:rPr>
+        <w:t>ilters for year</w:t>
+      </w:r>
+      <w:r>
+        <w:rPr>
+          <w:rFonts w:ascii="Georgia" w:eastAsia="Georgia" w:hAnsi="Georgia" w:cs="Georgia"/>
+          <w:sz w:val="22"/>
+          <w:szCs w:val="22"/>
+        </w:rPr>
+        <w:t>,</w:t>
+      </w:r>
+      <w:r>
+        <w:rPr>
+          <w:rFonts w:ascii="Georgia" w:eastAsia="Georgia" w:hAnsi="Georgia" w:cs="Georgia"/>
+          <w:sz w:val="22"/>
+          <w:szCs w:val="22"/>
+        </w:rPr>
+        <w:t xml:space="preserve"> field of study</w:t>
+      </w:r>
+      <w:r>
+        <w:rPr>
+          <w:rFonts w:ascii="Georgia" w:eastAsia="Georgia" w:hAnsi="Georgia" w:cs="Georgia"/>
+          <w:sz w:val="22"/>
+          <w:szCs w:val="22"/>
+        </w:rPr>
+        <w:t xml:space="preserve">, and </w:t>
+      </w:r>
+      <w:r>
+        <w:rPr>
+          <w:rFonts w:ascii="Georgia" w:eastAsia="Georgia" w:hAnsi="Georgia" w:cs="Georgia"/>
+          <w:sz w:val="22"/>
+          <w:szCs w:val="22"/>
+        </w:rPr>
+        <w:t>program type.</w:t>
+      </w:r>
+    </w:p>
+    <w:p>
+      <w:pPr>
+        <w:pStyle w:val="ListParagraph"/>
+        <w:numPr>
+          <w:ilvl w:val="0"/>
+          <w:numId w:val="4"/>
+        </w:numPr>
+        <w:shd w:val="clear" w:color="auto" w:fill="FFFFFF"/>
+        <w:rPr>
+          <w:rFonts w:ascii="Georgia" w:eastAsia="Georgia" w:hAnsi="Georgia" w:cs="Georgia"/>
+          <w:sz w:val="22"/>
+          <w:szCs w:val="22"/>
+        </w:rPr>
+      </w:pPr>
+      <w:r>
+        <w:rPr>
+          <w:rFonts w:ascii="Georgia" w:eastAsia="Georgia" w:hAnsi="Georgia" w:cs="Georgia"/>
+          <w:sz w:val="22"/>
+          <w:szCs w:val="22"/>
+        </w:rPr>
+        <w:t xml:space="preserve">A </w:t>
+      </w:r>
+      <w:r>
+        <w:rPr>
+          <w:rFonts w:ascii="Georgia" w:eastAsia="Georgia" w:hAnsi="Georgia" w:cs="Georgia"/>
+          <w:sz w:val="22"/>
+          <w:szCs w:val="22"/>
+        </w:rPr>
+        <w:t>short</w:t>
+      </w:r>
+      <w:r>
+        <w:rPr>
+          <w:rFonts w:ascii="Georgia" w:eastAsia="Georgia" w:hAnsi="Georgia" w:cs="Georgia"/>
+          <w:sz w:val="22"/>
+          <w:szCs w:val="22"/>
+        </w:rPr>
+        <w:t>,</w:t>
+      </w:r>
+      <w:r>
+        <w:rPr>
+          <w:rFonts w:ascii="Georgia" w:eastAsia="Georgia" w:hAnsi="Georgia" w:cs="Georgia"/>
+          <w:sz w:val="22"/>
+          <w:szCs w:val="22"/>
+        </w:rPr>
+        <w:t xml:space="preserve"> written analysis explaining key findings, limitations, and </w:t>
+      </w:r>
+      <w:r>
+        <w:rPr>
+          <w:rFonts w:ascii="Georgia" w:eastAsia="Georgia" w:hAnsi="Georgia" w:cs="Georgia"/>
+          <w:sz w:val="22"/>
+          <w:szCs w:val="22"/>
+        </w:rPr>
+        <w:t>implications</w:t>
+      </w:r>
+    </w:p>
+    <w:p>
+      <w:pPr>
+        <w:shd w:val="clear" w:color="auto" w:fill="FFFFFF"/>
+        <w:rPr>
+          <w:rFonts w:ascii="Georgia" w:eastAsia="Georgia" w:hAnsi="Georgia" w:cs="Georgia"/>
+          <w:sz w:val="22"/>
+          <w:szCs w:val="22"/>
+        </w:rPr>
+      </w:pPr>
+    </w:p>
+    <w:p>
+      <w:pPr>
+        <w:shd w:val="clear" w:color="auto" w:fill="FFFFFF"/>
+        <w:rPr>
+          <w:rFonts w:ascii="Georgia" w:eastAsia="Georgia" w:hAnsi="Georgia" w:cs="Georgia"/>
+          <w:sz w:val="22"/>
+          <w:szCs w:val="22"/>
+        </w:rPr>
+      </w:pPr>
+      <w:r>
+        <w:rPr>
+          <w:rFonts w:ascii="Georgia" w:eastAsia="Georgia" w:hAnsi="Georgia" w:cs="Georgia"/>
+          <w:sz w:val="22"/>
+          <w:szCs w:val="22"/>
+        </w:rPr>
+        <w:t>Intended audience:</w:t>
+      </w:r>
+    </w:p>
+    <w:p>
+      <w:pPr>
+        <w:pStyle w:val="ListParagraph"/>
+        <w:numPr>
+          <w:ilvl w:val="0"/>
+          <w:numId w:val="5"/>
+        </w:numPr>
+        <w:shd w:val="clear" w:color="auto" w:fill="FFFFFF"/>
+        <w:rPr>
+          <w:rFonts w:ascii="Georgia" w:eastAsia="Georgia" w:hAnsi="Georgia" w:cs="Georgia"/>
+          <w:sz w:val="22"/>
+          <w:szCs w:val="22"/>
+        </w:rPr>
+      </w:pPr>
+      <w:r>
+        <w:rPr>
+          <w:rFonts w:ascii="Georgia" w:eastAsia="Georgia" w:hAnsi="Georgia" w:cs="Georgia"/>
+          <w:sz w:val="22"/>
+          <w:szCs w:val="22"/>
+        </w:rPr>
+        <w:t>Students considering postsecondary options</w:t>
+      </w:r>
+    </w:p>
+    <w:p>
+      <w:pPr>
+        <w:pStyle w:val="ListParagraph"/>
+        <w:numPr>
+          <w:ilvl w:val="0"/>
+          <w:numId w:val="5"/>
+        </w:numPr>
+        <w:shd w:val="clear" w:color="auto" w:fill="FFFFFF"/>
+        <w:rPr>
+          <w:rFonts w:ascii="Georgia" w:eastAsia="Georgia" w:hAnsi="Georgia" w:cs="Georgia"/>
+          <w:sz w:val="22"/>
+          <w:szCs w:val="22"/>
+        </w:rPr>
+      </w:pPr>
+      <w:r>
+        <w:rPr>
+          <w:rFonts w:ascii="Georgia" w:eastAsia="Georgia" w:hAnsi="Georgia" w:cs="Georgia"/>
+          <w:sz w:val="22"/>
+          <w:szCs w:val="22"/>
+        </w:rPr>
+        <w:t>Guidance counselors and academic advisors</w:t>
+      </w:r>
+    </w:p>
+    <w:p>
+      <w:pPr>
+        <w:pStyle w:val="ListParagraph"/>
+        <w:numPr>
+          <w:ilvl w:val="0"/>
+          <w:numId w:val="5"/>
+        </w:numPr>
+        <w:shd w:val="clear" w:color="auto" w:fill="FFFFFF"/>
+        <w:rPr>
+          <w:rFonts w:ascii="Georgia" w:eastAsia="Georgia" w:hAnsi="Georgia" w:cs="Georgia"/>
+          <w:sz w:val="22"/>
+          <w:szCs w:val="22"/>
+        </w:rPr>
+      </w:pPr>
+      <w:r>
+        <w:rPr>
+          <w:rFonts w:ascii="Georgia" w:eastAsia="Georgia" w:hAnsi="Georgia" w:cs="Georgia"/>
+          <w:sz w:val="22"/>
+          <w:szCs w:val="22"/>
+        </w:rPr>
+        <w:t>Workforce development stakeholders</w:t>
+      </w:r>
+    </w:p>
+    <w:p>
+      <w:pPr>
+        <w:pStyle w:val="ListParagraph"/>
+        <w:numPr>
+          <w:ilvl w:val="0"/>
+          <w:numId w:val="5"/>
+        </w:numPr>
+        <w:shd w:val="clear" w:color="auto" w:fill="FFFFFF"/>
+        <w:rPr>
+          <w:rFonts w:ascii="Georgia" w:eastAsia="Georgia" w:hAnsi="Georgia" w:cs="Georgia"/>
+          <w:sz w:val="22"/>
+          <w:szCs w:val="22"/>
+        </w:rPr>
+      </w:pPr>
+      <w:r>
+        <w:rPr>
+          <w:rFonts w:ascii="Georgia" w:eastAsia="Georgia" w:hAnsi="Georgia" w:cs="Georgia"/>
+          <w:sz w:val="22"/>
+          <w:szCs w:val="22"/>
+        </w:rPr>
+        <w:t xml:space="preserve">Adult learners </w:t>
+      </w:r>
+      <w:r>
+        <w:rPr>
+          <w:rFonts w:ascii="Georgia" w:eastAsia="Georgia" w:hAnsi="Georgia" w:cs="Georgia"/>
+          <w:sz w:val="22"/>
+          <w:szCs w:val="22"/>
+        </w:rPr>
+        <w:t>considering</w:t>
+      </w:r>
+      <w:r>
+        <w:rPr>
+          <w:rFonts w:ascii="Georgia" w:eastAsia="Georgia" w:hAnsi="Georgia" w:cs="Georgia"/>
+          <w:sz w:val="22"/>
+          <w:szCs w:val="22"/>
+        </w:rPr>
+        <w:t xml:space="preserve"> career pivot pathways</w:t>
+      </w:r>
+    </w:p>
+    <w:p>
+      <w:pPr>
+        <w:shd w:val="clear" w:color="auto" w:fill="FFFFFF"/>
+        <w:rPr>
+          <w:rFonts w:ascii="Georgia" w:eastAsia="Georgia" w:hAnsi="Georgia" w:cs="Georgia"/>
+          <w:sz w:val="22"/>
+          <w:szCs w:val="22"/>
+        </w:rPr>
+      </w:pPr>
+    </w:p>
+    <w:p>
+      <w:pPr>
+        <w:shd w:val="clear" w:color="auto" w:fill="FFFFFF"/>
+        <w:rPr>
+          <w:rFonts w:ascii="Georgia" w:eastAsia="Georgia" w:hAnsi="Georgia" w:cs="Georgia"/>
+          <w:sz w:val="22"/>
+          <w:szCs w:val="22"/>
+        </w:rPr>
+      </w:pPr>
+    </w:p>
+    <w:p>
+      <w:pPr>
+        <w:shd w:val="clear" w:color="auto" w:fill="FFFFFF"/>
+        <w:rPr>
+          <w:rFonts w:ascii="Georgia" w:eastAsia="Georgia" w:hAnsi="Georgia" w:cs="Georgia"/>
+          <w:sz w:val="22"/>
+          <w:szCs w:val="22"/>
+        </w:rPr>
+      </w:pPr>
+    </w:p>
+    <w:p>
+      <w:pPr>
+        <w:shd w:val="clear" w:color="auto" w:fill="FFFFFF"/>
+        <w:rPr>
+          <w:rFonts w:ascii="Georgia" w:eastAsia="Georgia" w:hAnsi="Georgia" w:cs="Georgia"/>
+          <w:sz w:val="22"/>
+          <w:szCs w:val="22"/>
+        </w:rPr>
+      </w:pPr>
+    </w:p>
+    <w:p>
+      <w:pPr>
+        <w:shd w:val="clear" w:color="auto" w:fill="FFFFFF"/>
         <w:rPr>
           <w:rFonts w:ascii="Verdana" w:eastAsia="Verdana" w:hAnsi="Verdana" w:cs="Verdana"/>
           <w:b/>
           <w:color w:val="538135"/>
-          <w:sz w:val="38"/>
-          <w:szCs w:val="38"/>
-        </w:rPr>
-        <w:t>Minimum Viable Product (MVP)</w:t>
-      </w:r>
-    </w:p>
-    <w:p>
-      <w:pPr>
-        <w:shd w:val="clear" w:color="auto" w:fill="FFFFFF"/>
-        <w:rPr>
-          <w:rFonts w:ascii="Georgia" w:eastAsia="Georgia" w:hAnsi="Georgia" w:cs="Georgia"/>
-          <w:i/>
-        </w:rPr>
-      </w:pPr>
-      <w:r>
-        <w:rPr>
-          <w:rFonts w:ascii="Georgia" w:eastAsia="Georgia" w:hAnsi="Georgia" w:cs="Georgia"/>
-          <w:i/>
-        </w:rPr>
-        <w:t>Define your MVP. This should be a description of what your final capstone will look like, including visualizations, how the analysis will be presented, who the intended audience is, etc.</w:t>
-      </w:r>
-    </w:p>
-    <w:p>
-      <w:pPr>
-        <w:shd w:val="clear" w:color="auto" w:fill="FFFFFF"/>
+          <w:sz w:val="32"/>
+          <w:szCs w:val="32"/>
+        </w:rPr>
+      </w:pPr>
+      <w:r>
         <w:rPr>
           <w:rFonts w:ascii="Verdana" w:eastAsia="Verdana" w:hAnsi="Verdana" w:cs="Verdana"/>
           <w:b/>
           <w:color w:val="538135"/>
-          <w:sz w:val="38"/>
-          <w:szCs w:val="38"/>
-        </w:rPr>
-      </w:pPr>
-    </w:p>
-    <w:p>
-      <w:pPr>
-        <w:shd w:val="clear" w:color="auto" w:fill="FFFFFF"/>
+          <w:sz w:val="32"/>
+          <w:szCs w:val="32"/>
+        </w:rPr>
+        <w:lastRenderedPageBreak/>
+        <w:t xml:space="preserve">Schedule (through </w:t>
+      </w:r>
+      <w:r>
         <w:rPr>
           <w:rFonts w:ascii="Verdana" w:eastAsia="Verdana" w:hAnsi="Verdana" w:cs="Verdana"/>
           <w:b/>
           <w:color w:val="538135"/>
-          <w:sz w:val="38"/>
-          <w:szCs w:val="38"/>
-        </w:rPr>
-      </w:pPr>
-      <w:r>
-        <w:rPr>
-          <w:rFonts w:ascii="Verdana" w:eastAsia="Verdana" w:hAnsi="Verdana" w:cs="Verdana"/>
-          <w:b/>
-          <w:color w:val="538135"/>
-          <w:sz w:val="38"/>
-          <w:szCs w:val="38"/>
-        </w:rPr>
-        <w:t>Schedule (through &lt;date of demo day&gt;)</w:t>
+          <w:sz w:val="32"/>
+          <w:szCs w:val="32"/>
+        </w:rPr>
+        <w:t>March 12)</w:t>
       </w:r>
     </w:p>
     <w:p>
@@ -224,26 +1191,34 @@
         <w:rPr>
           <w:rFonts w:ascii="Georgia" w:eastAsia="Georgia" w:hAnsi="Georgia" w:cs="Georgia"/>
           <w:color w:val="010101"/>
-        </w:rPr>
-      </w:pPr>
-      <w:r>
-        <w:rPr>
-          <w:rFonts w:ascii="Georgia" w:eastAsia="Georgia" w:hAnsi="Georgia" w:cs="Georgia"/>
-          <w:color w:val="010101"/>
+          <w:sz w:val="22"/>
+          <w:szCs w:val="22"/>
+        </w:rPr>
+      </w:pPr>
+      <w:r>
+        <w:rPr>
+          <w:rFonts w:ascii="Georgia" w:eastAsia="Georgia" w:hAnsi="Georgia" w:cs="Georgia"/>
+          <w:color w:val="010101"/>
+          <w:sz w:val="22"/>
+          <w:szCs w:val="22"/>
         </w:rPr>
         <w:t>Get the Data (</w:t>
       </w:r>
       <w:r>
         <w:rPr>
           <w:rFonts w:ascii="Georgia" w:eastAsia="Georgia" w:hAnsi="Georgia" w:cs="Georgia"/>
-          <w:color w:val="FF0000"/>
-        </w:rPr>
-        <w:t>finish date</w:t>
-      </w:r>
-      <w:r>
-        <w:rPr>
-          <w:rFonts w:ascii="Georgia" w:eastAsia="Georgia" w:hAnsi="Georgia" w:cs="Georgia"/>
-          <w:color w:val="010101"/>
+          <w:color w:val="010101"/>
+          <w:sz w:val="22"/>
+          <w:szCs w:val="22"/>
+        </w:rPr>
+        <w:t>January 26</w:t>
+      </w:r>
+      <w:r>
+        <w:rPr>
+          <w:rFonts w:ascii="Georgia" w:eastAsia="Georgia" w:hAnsi="Georgia" w:cs="Georgia"/>
+          <w:color w:val="010101"/>
+          <w:sz w:val="22"/>
+          <w:szCs w:val="22"/>
         </w:rPr>
         <w:t>)</w:t>
       </w:r>
@@ -265,26 +1240,43 @@
         <w:rPr>
           <w:rFonts w:ascii="Georgia" w:eastAsia="Georgia" w:hAnsi="Georgia" w:cs="Georgia"/>
           <w:color w:val="010101"/>
-        </w:rPr>
-      </w:pPr>
-      <w:r>
-        <w:rPr>
-          <w:rFonts w:ascii="Georgia" w:eastAsia="Georgia" w:hAnsi="Georgia" w:cs="Georgia"/>
-          <w:color w:val="010101"/>
+          <w:sz w:val="22"/>
+          <w:szCs w:val="22"/>
+        </w:rPr>
+      </w:pPr>
+      <w:r>
+        <w:rPr>
+          <w:rFonts w:ascii="Georgia" w:eastAsia="Georgia" w:hAnsi="Georgia" w:cs="Georgia"/>
+          <w:color w:val="010101"/>
+          <w:sz w:val="22"/>
+          <w:szCs w:val="22"/>
         </w:rPr>
         <w:t>Clean &amp; Explore the Data (</w:t>
       </w:r>
       <w:r>
         <w:rPr>
           <w:rFonts w:ascii="Georgia" w:eastAsia="Georgia" w:hAnsi="Georgia" w:cs="Georgia"/>
-          <w:color w:val="FF0000"/>
-        </w:rPr>
-        <w:t>finish date</w:t>
-      </w:r>
-      <w:r>
-        <w:rPr>
-          <w:rFonts w:ascii="Georgia" w:eastAsia="Georgia" w:hAnsi="Georgia" w:cs="Georgia"/>
-          <w:color w:val="010101"/>
+          <w:color w:val="010101"/>
+          <w:sz w:val="22"/>
+          <w:szCs w:val="22"/>
+        </w:rPr>
+        <w:t xml:space="preserve">February </w:t>
+      </w:r>
+      <w:r>
+        <w:rPr>
+          <w:rFonts w:ascii="Georgia" w:eastAsia="Georgia" w:hAnsi="Georgia" w:cs="Georgia"/>
+          <w:color w:val="010101"/>
+          <w:sz w:val="22"/>
+          <w:szCs w:val="22"/>
+        </w:rPr>
+        <w:t>7</w:t>
+      </w:r>
+      <w:r>
+        <w:rPr>
+          <w:rFonts w:ascii="Georgia" w:eastAsia="Georgia" w:hAnsi="Georgia" w:cs="Georgia"/>
+          <w:color w:val="010101"/>
+          <w:sz w:val="22"/>
+          <w:szCs w:val="22"/>
         </w:rPr>
         <w:t>)</w:t>
       </w:r>
@@ -306,26 +1298,43 @@
         <w:rPr>
           <w:rFonts w:ascii="Georgia" w:eastAsia="Georgia" w:hAnsi="Georgia" w:cs="Georgia"/>
           <w:color w:val="010101"/>
-        </w:rPr>
-      </w:pPr>
-      <w:r>
-        <w:rPr>
-          <w:rFonts w:ascii="Georgia" w:eastAsia="Georgia" w:hAnsi="Georgia" w:cs="Georgia"/>
-          <w:color w:val="010101"/>
+          <w:sz w:val="22"/>
+          <w:szCs w:val="22"/>
+        </w:rPr>
+      </w:pPr>
+      <w:r>
+        <w:rPr>
+          <w:rFonts w:ascii="Georgia" w:eastAsia="Georgia" w:hAnsi="Georgia" w:cs="Georgia"/>
+          <w:color w:val="010101"/>
+          <w:sz w:val="22"/>
+          <w:szCs w:val="22"/>
         </w:rPr>
         <w:t>Create Presentation of your Analysis (</w:t>
       </w:r>
       <w:r>
         <w:rPr>
           <w:rFonts w:ascii="Georgia" w:eastAsia="Georgia" w:hAnsi="Georgia" w:cs="Georgia"/>
-          <w:color w:val="FF0000"/>
-        </w:rPr>
-        <w:t>finish date</w:t>
-      </w:r>
-      <w:r>
-        <w:rPr>
-          <w:rFonts w:ascii="Georgia" w:eastAsia="Georgia" w:hAnsi="Georgia" w:cs="Georgia"/>
-          <w:color w:val="010101"/>
+          <w:color w:val="010101"/>
+          <w:sz w:val="22"/>
+          <w:szCs w:val="22"/>
+        </w:rPr>
+        <w:t>February 2</w:t>
+      </w:r>
+      <w:r>
+        <w:rPr>
+          <w:rFonts w:ascii="Georgia" w:eastAsia="Georgia" w:hAnsi="Georgia" w:cs="Georgia"/>
+          <w:color w:val="010101"/>
+          <w:sz w:val="22"/>
+          <w:szCs w:val="22"/>
+        </w:rPr>
+        <w:t>4</w:t>
+      </w:r>
+      <w:r>
+        <w:rPr>
+          <w:rFonts w:ascii="Georgia" w:eastAsia="Georgia" w:hAnsi="Georgia" w:cs="Georgia"/>
+          <w:color w:val="010101"/>
+          <w:sz w:val="22"/>
+          <w:szCs w:val="22"/>
         </w:rPr>
         <w:t>)</w:t>
       </w:r>
@@ -347,12 +1356,16 @@
         <w:rPr>
           <w:rFonts w:ascii="Georgia" w:eastAsia="Georgia" w:hAnsi="Georgia" w:cs="Georgia"/>
           <w:color w:val="010101"/>
-        </w:rPr>
-      </w:pPr>
-      <w:r>
-        <w:rPr>
-          <w:rFonts w:ascii="Georgia" w:eastAsia="Georgia" w:hAnsi="Georgia" w:cs="Georgia"/>
-          <w:color w:val="010101"/>
+          <w:sz w:val="22"/>
+          <w:szCs w:val="22"/>
+        </w:rPr>
+      </w:pPr>
+      <w:r>
+        <w:rPr>
+          <w:rFonts w:ascii="Georgia" w:eastAsia="Georgia" w:hAnsi="Georgia" w:cs="Georgia"/>
+          <w:color w:val="010101"/>
+          <w:sz w:val="22"/>
+          <w:szCs w:val="22"/>
         </w:rPr>
         <w:t xml:space="preserve">Should be a presentation, but could include a </w:t>
       </w:r>
@@ -361,6 +1374,8 @@
         <w:rPr>
           <w:rFonts w:ascii="Georgia" w:eastAsia="Georgia" w:hAnsi="Georgia" w:cs="Georgia"/>
           <w:color w:val="010101"/>
+          <w:sz w:val="22"/>
+          <w:szCs w:val="22"/>
         </w:rPr>
         <w:t>Jupyter</w:t>
       </w:r>
@@ -369,6 +1384,8 @@
         <w:rPr>
           <w:rFonts w:ascii="Georgia" w:eastAsia="Georgia" w:hAnsi="Georgia" w:cs="Georgia"/>
           <w:color w:val="010101"/>
+          <w:sz w:val="22"/>
+          <w:szCs w:val="22"/>
         </w:rPr>
         <w:t xml:space="preserve"> Notebook or dashboard in Excel, Tableau, or </w:t>
       </w:r>
@@ -377,6 +1394,8 @@
         <w:rPr>
           <w:rFonts w:ascii="Georgia" w:eastAsia="Georgia" w:hAnsi="Georgia" w:cs="Georgia"/>
           <w:color w:val="010101"/>
+          <w:sz w:val="22"/>
+          <w:szCs w:val="22"/>
         </w:rPr>
         <w:t>PowerBI</w:t>
       </w:r>
@@ -399,26 +1418,34 @@
         <w:rPr>
           <w:rFonts w:ascii="Georgia" w:eastAsia="Georgia" w:hAnsi="Georgia" w:cs="Georgia"/>
           <w:color w:val="010101"/>
-        </w:rPr>
-      </w:pPr>
-      <w:r>
-        <w:rPr>
-          <w:rFonts w:ascii="Georgia" w:eastAsia="Georgia" w:hAnsi="Georgia" w:cs="Georgia"/>
-          <w:color w:val="010101"/>
+          <w:sz w:val="22"/>
+          <w:szCs w:val="22"/>
+        </w:rPr>
+      </w:pPr>
+      <w:r>
+        <w:rPr>
+          <w:rFonts w:ascii="Georgia" w:eastAsia="Georgia" w:hAnsi="Georgia" w:cs="Georgia"/>
+          <w:color w:val="010101"/>
+          <w:sz w:val="22"/>
+          <w:szCs w:val="22"/>
         </w:rPr>
         <w:t>Internal demos (</w:t>
       </w:r>
       <w:r>
         <w:rPr>
           <w:rFonts w:ascii="Georgia" w:eastAsia="Georgia" w:hAnsi="Georgia" w:cs="Georgia"/>
-          <w:color w:val="FF0000"/>
-        </w:rPr>
-        <w:t>&lt;date of internal demos</w:t>
-      </w:r>
-      <w:r>
-        <w:rPr>
-          <w:rFonts w:ascii="Georgia" w:eastAsia="Georgia" w:hAnsi="Georgia" w:cs="Georgia"/>
-          <w:color w:val="010101"/>
+          <w:color w:val="010101"/>
+          <w:sz w:val="22"/>
+          <w:szCs w:val="22"/>
+        </w:rPr>
+        <w:t>March 3</w:t>
+      </w:r>
+      <w:r>
+        <w:rPr>
+          <w:rFonts w:ascii="Georgia" w:eastAsia="Georgia" w:hAnsi="Georgia" w:cs="Georgia"/>
+          <w:color w:val="010101"/>
+          <w:sz w:val="22"/>
+          <w:szCs w:val="22"/>
         </w:rPr>
         <w:t>)</w:t>
       </w:r>
@@ -440,6 +1467,8 @@
         <w:rPr>
           <w:rFonts w:ascii="Georgia" w:eastAsia="Georgia" w:hAnsi="Georgia" w:cs="Georgia"/>
           <w:color w:val="010101"/>
+          <w:sz w:val="22"/>
+          <w:szCs w:val="22"/>
         </w:rPr>
       </w:pPr>
       <w:bookmarkStart w:id="0" w:name="_heading=h.gjdgxs" w:colFirst="0" w:colLast="0"/>
@@ -448,20 +1477,26 @@
         <w:rPr>
           <w:rFonts w:ascii="Georgia" w:eastAsia="Georgia" w:hAnsi="Georgia" w:cs="Georgia"/>
           <w:color w:val="010101"/>
+          <w:sz w:val="22"/>
+          <w:szCs w:val="22"/>
         </w:rPr>
         <w:t>Demo Day!! (</w:t>
       </w:r>
       <w:r>
         <w:rPr>
           <w:rFonts w:ascii="Georgia" w:eastAsia="Georgia" w:hAnsi="Georgia" w:cs="Georgia"/>
-          <w:color w:val="FF0000"/>
-        </w:rPr>
-        <w:t>&lt;date of demo day&gt;</w:t>
-      </w:r>
-      <w:r>
-        <w:rPr>
-          <w:rFonts w:ascii="Georgia" w:eastAsia="Georgia" w:hAnsi="Georgia" w:cs="Georgia"/>
-          <w:color w:val="010101"/>
+          <w:color w:val="010101"/>
+          <w:sz w:val="22"/>
+          <w:szCs w:val="22"/>
+        </w:rPr>
+        <w:t>March 12</w:t>
+      </w:r>
+      <w:r>
+        <w:rPr>
+          <w:rFonts w:ascii="Georgia" w:eastAsia="Georgia" w:hAnsi="Georgia" w:cs="Georgia"/>
+          <w:color w:val="010101"/>
+          <w:sz w:val="22"/>
+          <w:szCs w:val="22"/>
         </w:rPr>
         <w:t>)</w:t>
       </w:r>
@@ -472,6 +1507,8 @@
         <w:rPr>
           <w:rFonts w:ascii="Georgia" w:eastAsia="Georgia" w:hAnsi="Georgia" w:cs="Georgia"/>
           <w:color w:val="010101"/>
+          <w:sz w:val="22"/>
+          <w:szCs w:val="22"/>
         </w:rPr>
       </w:pPr>
     </w:p>
@@ -482,8 +1519,8 @@
           <w:rFonts w:ascii="Verdana" w:eastAsia="Verdana" w:hAnsi="Verdana" w:cs="Verdana"/>
           <w:b/>
           <w:color w:val="538135"/>
-          <w:sz w:val="38"/>
-          <w:szCs w:val="38"/>
+          <w:sz w:val="32"/>
+          <w:szCs w:val="32"/>
         </w:rPr>
       </w:pPr>
       <w:r>
@@ -491,8 +1528,8 @@
           <w:rFonts w:ascii="Verdana" w:eastAsia="Verdana" w:hAnsi="Verdana" w:cs="Verdana"/>
           <w:b/>
           <w:color w:val="538135"/>
-          <w:sz w:val="38"/>
-          <w:szCs w:val="38"/>
+          <w:sz w:val="32"/>
+          <w:szCs w:val="32"/>
         </w:rPr>
         <w:t>Data Sources</w:t>
       </w:r>
@@ -500,20 +1537,641 @@
     <w:p>
       <w:pPr>
         <w:shd w:val="clear" w:color="auto" w:fill="FFFFFF"/>
-        <w:spacing w:after="402"/>
-        <w:rPr>
-          <w:rFonts w:ascii="Georgia" w:eastAsia="Georgia" w:hAnsi="Georgia" w:cs="Georgia"/>
-          <w:i/>
-          <w:color w:val="010101"/>
-        </w:rPr>
-      </w:pPr>
-      <w:r>
-        <w:rPr>
-          <w:rFonts w:ascii="Georgia" w:eastAsia="Georgia" w:hAnsi="Georgia" w:cs="Georgia"/>
-          <w:i/>
-          <w:color w:val="010101"/>
-        </w:rPr>
-        <w:t>Document the data you use and the source of that data</w:t>
+        <w:rPr>
+          <w:rFonts w:ascii="Georgia" w:eastAsia="Georgia" w:hAnsi="Georgia" w:cs="Georgia"/>
+          <w:color w:val="010101"/>
+          <w:sz w:val="22"/>
+          <w:szCs w:val="22"/>
+        </w:rPr>
+      </w:pPr>
+      <w:r>
+        <w:rPr>
+          <w:rFonts w:ascii="Georgia" w:eastAsia="Georgia" w:hAnsi="Georgia" w:cs="Georgia"/>
+          <w:color w:val="010101"/>
+          <w:sz w:val="22"/>
+          <w:szCs w:val="22"/>
+        </w:rPr>
+        <w:t>IPEDS</w:t>
+      </w:r>
+      <w:r>
+        <w:rPr>
+          <w:rFonts w:ascii="Georgia" w:eastAsia="Georgia" w:hAnsi="Georgia" w:cs="Georgia"/>
+          <w:color w:val="010101"/>
+          <w:sz w:val="22"/>
+          <w:szCs w:val="22"/>
+        </w:rPr>
+        <w:t xml:space="preserve">: </w:t>
+      </w:r>
+      <w:r>
+        <w:rPr>
+          <w:rFonts w:ascii="Georgia" w:eastAsia="Georgia" w:hAnsi="Georgia" w:cs="Georgia"/>
+          <w:color w:val="010101"/>
+          <w:sz w:val="22"/>
+          <w:szCs w:val="22"/>
+        </w:rPr>
+        <w:tab/>
+      </w:r>
+      <w:r>
+        <w:rPr>
+          <w:rFonts w:ascii="Georgia" w:eastAsia="Georgia" w:hAnsi="Georgia" w:cs="Georgia"/>
+          <w:color w:val="010101"/>
+          <w:sz w:val="22"/>
+          <w:szCs w:val="22"/>
+        </w:rPr>
+        <w:tab/>
+      </w:r>
+      <w:r>
+        <w:rPr>
+          <w:rFonts w:ascii="Georgia" w:eastAsia="Georgia" w:hAnsi="Georgia" w:cs="Georgia"/>
+          <w:color w:val="010101"/>
+          <w:sz w:val="22"/>
+          <w:szCs w:val="22"/>
+        </w:rPr>
+        <w:tab/>
+      </w:r>
+      <w:hyperlink r:id="rId9" w:history="1">
+        <w:r>
+          <w:rPr>
+            <w:rStyle w:val="Hyperlink"/>
+            <w:rFonts w:ascii="Georgia" w:eastAsia="Georgia" w:hAnsi="Georgia" w:cs="Georgia"/>
+            <w:sz w:val="22"/>
+            <w:szCs w:val="22"/>
+          </w:rPr>
+          <w:t>https://nces.ed.gov/ipeds</w:t>
+        </w:r>
+      </w:hyperlink>
+    </w:p>
+    <w:p>
+      <w:pPr>
+        <w:shd w:val="clear" w:color="auto" w:fill="FFFFFF"/>
+        <w:ind w:left="2880"/>
+        <w:rPr>
+          <w:rFonts w:ascii="Georgia" w:eastAsia="Georgia" w:hAnsi="Georgia" w:cs="Georgia"/>
+          <w:color w:val="010101"/>
+          <w:sz w:val="22"/>
+          <w:szCs w:val="22"/>
+        </w:rPr>
+      </w:pPr>
+      <w:r>
+        <w:rPr>
+          <w:rFonts w:ascii="Georgia" w:eastAsia="Georgia" w:hAnsi="Georgia" w:cs="Georgia"/>
+          <w:color w:val="010101"/>
+          <w:sz w:val="22"/>
+          <w:szCs w:val="22"/>
+        </w:rPr>
+        <w:t>Completions files contain data for awards and degrees conferred by program (CIP code).</w:t>
+      </w:r>
+    </w:p>
+    <w:p>
+      <w:pPr>
+        <w:pStyle w:val="ListParagraph"/>
+        <w:numPr>
+          <w:ilvl w:val="0"/>
+          <w:numId w:val="7"/>
+        </w:numPr>
+        <w:shd w:val="clear" w:color="auto" w:fill="FFFFFF"/>
+        <w:rPr>
+          <w:rFonts w:ascii="Georgia" w:eastAsia="Georgia" w:hAnsi="Georgia" w:cs="Georgia"/>
+          <w:color w:val="010101"/>
+          <w:sz w:val="22"/>
+          <w:szCs w:val="22"/>
+        </w:rPr>
+      </w:pPr>
+      <w:r>
+        <w:rPr>
+          <w:rFonts w:ascii="Georgia" w:eastAsia="Georgia" w:hAnsi="Georgia" w:cs="Georgia"/>
+          <w:color w:val="010101"/>
+          <w:sz w:val="22"/>
+          <w:szCs w:val="22"/>
+        </w:rPr>
+        <w:t>c2011_A.</w:t>
+      </w:r>
+      <w:r>
+        <w:rPr>
+          <w:rFonts w:ascii="Georgia" w:eastAsia="Georgia" w:hAnsi="Georgia" w:cs="Georgia"/>
+          <w:color w:val="010101"/>
+          <w:sz w:val="22"/>
+          <w:szCs w:val="22"/>
+        </w:rPr>
+        <w:t>csv</w:t>
+      </w:r>
+    </w:p>
+    <w:p>
+      <w:pPr>
+        <w:pStyle w:val="ListParagraph"/>
+        <w:numPr>
+          <w:ilvl w:val="0"/>
+          <w:numId w:val="7"/>
+        </w:numPr>
+        <w:shd w:val="clear" w:color="auto" w:fill="FFFFFF"/>
+        <w:rPr>
+          <w:rFonts w:ascii="Georgia" w:eastAsia="Georgia" w:hAnsi="Georgia" w:cs="Georgia"/>
+          <w:color w:val="010101"/>
+          <w:sz w:val="22"/>
+          <w:szCs w:val="22"/>
+        </w:rPr>
+      </w:pPr>
+      <w:r>
+        <w:rPr>
+          <w:rFonts w:ascii="Georgia" w:eastAsia="Georgia" w:hAnsi="Georgia" w:cs="Georgia"/>
+          <w:color w:val="010101"/>
+          <w:sz w:val="22"/>
+          <w:szCs w:val="22"/>
+        </w:rPr>
+        <w:t>c2021_A.</w:t>
+      </w:r>
+      <w:r>
+        <w:rPr>
+          <w:rFonts w:ascii="Georgia" w:eastAsia="Georgia" w:hAnsi="Georgia" w:cs="Georgia"/>
+          <w:color w:val="010101"/>
+          <w:sz w:val="22"/>
+          <w:szCs w:val="22"/>
+        </w:rPr>
+        <w:t>csv</w:t>
+      </w:r>
+    </w:p>
+    <w:p>
+      <w:pPr>
+        <w:pStyle w:val="ListParagraph"/>
+        <w:numPr>
+          <w:ilvl w:val="0"/>
+          <w:numId w:val="7"/>
+        </w:numPr>
+        <w:shd w:val="clear" w:color="auto" w:fill="FFFFFF"/>
+        <w:rPr>
+          <w:rFonts w:ascii="Georgia" w:eastAsia="Georgia" w:hAnsi="Georgia" w:cs="Georgia"/>
+          <w:color w:val="010101"/>
+          <w:sz w:val="22"/>
+          <w:szCs w:val="22"/>
+        </w:rPr>
+      </w:pPr>
+      <w:r>
+        <w:rPr>
+          <w:rFonts w:ascii="Georgia" w:eastAsia="Georgia" w:hAnsi="Georgia" w:cs="Georgia"/>
+          <w:color w:val="010101"/>
+          <w:sz w:val="22"/>
+          <w:szCs w:val="22"/>
+        </w:rPr>
+        <w:t>c02</w:t>
+      </w:r>
+      <w:r>
+        <w:rPr>
+          <w:rFonts w:ascii="Georgia" w:eastAsia="Georgia" w:hAnsi="Georgia" w:cs="Georgia"/>
+          <w:color w:val="010101"/>
+          <w:sz w:val="22"/>
+          <w:szCs w:val="22"/>
+        </w:rPr>
+        <w:t>1_A_Dict.</w:t>
+      </w:r>
+      <w:r>
+        <w:rPr>
+          <w:rFonts w:ascii="Georgia" w:eastAsia="Georgia" w:hAnsi="Georgia" w:cs="Georgia"/>
+          <w:color w:val="010101"/>
+          <w:sz w:val="22"/>
+          <w:szCs w:val="22"/>
+        </w:rPr>
+        <w:t>xl</w:t>
+      </w:r>
+      <w:r>
+        <w:rPr>
+          <w:rFonts w:ascii="Georgia" w:eastAsia="Georgia" w:hAnsi="Georgia" w:cs="Georgia"/>
+          <w:color w:val="010101"/>
+          <w:sz w:val="22"/>
+          <w:szCs w:val="22"/>
+        </w:rPr>
+        <w:t>sx</w:t>
+      </w:r>
+    </w:p>
+    <w:p>
+      <w:pPr>
+        <w:shd w:val="clear" w:color="auto" w:fill="FFFFFF"/>
+        <w:rPr>
+          <w:rFonts w:ascii="Georgia" w:eastAsia="Georgia" w:hAnsi="Georgia" w:cs="Georgia"/>
+          <w:color w:val="010101"/>
+          <w:sz w:val="22"/>
+          <w:szCs w:val="22"/>
+        </w:rPr>
+      </w:pPr>
+    </w:p>
+    <w:p>
+      <w:pPr>
+        <w:shd w:val="clear" w:color="auto" w:fill="FFFFFF"/>
+        <w:ind w:left="2880"/>
+        <w:rPr>
+          <w:rFonts w:ascii="Georgia" w:eastAsia="Georgia" w:hAnsi="Georgia" w:cs="Georgia"/>
+          <w:color w:val="010101"/>
+          <w:sz w:val="22"/>
+          <w:szCs w:val="22"/>
+        </w:rPr>
+      </w:pPr>
+      <w:r>
+        <w:rPr>
+          <w:rFonts w:ascii="Georgia" w:eastAsia="Georgia" w:hAnsi="Georgia" w:cs="Georgia"/>
+          <w:color w:val="010101"/>
+          <w:sz w:val="22"/>
+          <w:szCs w:val="22"/>
+        </w:rPr>
+        <w:t xml:space="preserve">Institutional Characteristics files </w:t>
+      </w:r>
+      <w:r>
+        <w:rPr>
+          <w:rFonts w:ascii="Georgia" w:eastAsia="Georgia" w:hAnsi="Georgia" w:cs="Georgia"/>
+          <w:color w:val="010101"/>
+          <w:sz w:val="22"/>
+          <w:szCs w:val="22"/>
+        </w:rPr>
+        <w:t xml:space="preserve">contain data </w:t>
+      </w:r>
+      <w:r>
+        <w:rPr>
+          <w:rFonts w:ascii="Georgia" w:eastAsia="Georgia" w:hAnsi="Georgia" w:cs="Georgia"/>
+          <w:color w:val="010101"/>
+          <w:sz w:val="22"/>
+          <w:szCs w:val="22"/>
+        </w:rPr>
+        <w:t xml:space="preserve">for </w:t>
+      </w:r>
+      <w:r>
+        <w:rPr>
+          <w:rFonts w:ascii="Georgia" w:eastAsia="Georgia" w:hAnsi="Georgia" w:cs="Georgia"/>
+          <w:color w:val="010101"/>
+          <w:sz w:val="22"/>
+          <w:szCs w:val="22"/>
+        </w:rPr>
+        <w:t xml:space="preserve">the cost </w:t>
+      </w:r>
+      <w:r>
+        <w:rPr>
+          <w:rFonts w:ascii="Georgia" w:eastAsia="Georgia" w:hAnsi="Georgia" w:cs="Georgia"/>
+          <w:color w:val="010101"/>
+          <w:sz w:val="22"/>
+          <w:szCs w:val="22"/>
+        </w:rPr>
+        <w:t>of award and degree programs.</w:t>
+      </w:r>
+    </w:p>
+    <w:p>
+      <w:pPr>
+        <w:pStyle w:val="ListParagraph"/>
+        <w:numPr>
+          <w:ilvl w:val="0"/>
+          <w:numId w:val="8"/>
+        </w:numPr>
+        <w:shd w:val="clear" w:color="auto" w:fill="FFFFFF"/>
+        <w:rPr>
+          <w:rFonts w:ascii="Georgia" w:eastAsia="Georgia" w:hAnsi="Georgia" w:cs="Georgia"/>
+          <w:color w:val="010101"/>
+          <w:sz w:val="22"/>
+          <w:szCs w:val="22"/>
+        </w:rPr>
+      </w:pPr>
+      <w:r>
+        <w:rPr>
+          <w:rFonts w:ascii="Georgia" w:eastAsia="Georgia" w:hAnsi="Georgia" w:cs="Georgia"/>
+          <w:color w:val="010101"/>
+          <w:sz w:val="22"/>
+          <w:szCs w:val="22"/>
+        </w:rPr>
+        <w:t>IC2011</w:t>
+      </w:r>
+      <w:r>
+        <w:rPr>
+          <w:rFonts w:ascii="Georgia" w:eastAsia="Georgia" w:hAnsi="Georgia" w:cs="Georgia"/>
+          <w:color w:val="010101"/>
+          <w:sz w:val="22"/>
+          <w:szCs w:val="22"/>
+        </w:rPr>
+        <w:t>_</w:t>
+      </w:r>
+      <w:r>
+        <w:rPr>
+          <w:rFonts w:ascii="Georgia" w:eastAsia="Georgia" w:hAnsi="Georgia" w:cs="Georgia"/>
+          <w:color w:val="010101"/>
+          <w:sz w:val="22"/>
+          <w:szCs w:val="22"/>
+        </w:rPr>
+        <w:t>AY</w:t>
+      </w:r>
+      <w:r>
+        <w:rPr>
+          <w:rFonts w:ascii="Georgia" w:eastAsia="Georgia" w:hAnsi="Georgia" w:cs="Georgia"/>
+          <w:color w:val="010101"/>
+          <w:sz w:val="22"/>
+          <w:szCs w:val="22"/>
+        </w:rPr>
+        <w:t>.csv</w:t>
+      </w:r>
+    </w:p>
+    <w:p>
+      <w:pPr>
+        <w:pStyle w:val="ListParagraph"/>
+        <w:numPr>
+          <w:ilvl w:val="0"/>
+          <w:numId w:val="8"/>
+        </w:numPr>
+        <w:shd w:val="clear" w:color="auto" w:fill="FFFFFF"/>
+        <w:rPr>
+          <w:rFonts w:ascii="Georgia" w:eastAsia="Georgia" w:hAnsi="Georgia" w:cs="Georgia"/>
+          <w:color w:val="010101"/>
+          <w:sz w:val="22"/>
+          <w:szCs w:val="22"/>
+        </w:rPr>
+      </w:pPr>
+      <w:r>
+        <w:rPr>
+          <w:rFonts w:ascii="Georgia" w:eastAsia="Georgia" w:hAnsi="Georgia" w:cs="Georgia"/>
+          <w:color w:val="010101"/>
+          <w:sz w:val="22"/>
+          <w:szCs w:val="22"/>
+        </w:rPr>
+        <w:t>IC2021</w:t>
+      </w:r>
+      <w:r>
+        <w:rPr>
+          <w:rFonts w:ascii="Georgia" w:eastAsia="Georgia" w:hAnsi="Georgia" w:cs="Georgia"/>
+          <w:color w:val="010101"/>
+          <w:sz w:val="22"/>
+          <w:szCs w:val="22"/>
+        </w:rPr>
+        <w:t>_AY</w:t>
+      </w:r>
+      <w:r>
+        <w:rPr>
+          <w:rFonts w:ascii="Georgia" w:eastAsia="Georgia" w:hAnsi="Georgia" w:cs="Georgia"/>
+          <w:color w:val="010101"/>
+          <w:sz w:val="22"/>
+          <w:szCs w:val="22"/>
+        </w:rPr>
+        <w:t>.csv</w:t>
+      </w:r>
+    </w:p>
+    <w:p>
+      <w:pPr>
+        <w:shd w:val="clear" w:color="auto" w:fill="FFFFFF"/>
+        <w:rPr>
+          <w:rFonts w:ascii="Georgia" w:eastAsia="Georgia" w:hAnsi="Georgia" w:cs="Georgia"/>
+          <w:color w:val="010101"/>
+          <w:sz w:val="22"/>
+          <w:szCs w:val="22"/>
+        </w:rPr>
+      </w:pPr>
+    </w:p>
+    <w:p>
+      <w:pPr>
+        <w:shd w:val="clear" w:color="auto" w:fill="FFFFFF"/>
+        <w:rPr>
+          <w:sz w:val="22"/>
+          <w:szCs w:val="22"/>
+        </w:rPr>
+      </w:pPr>
+      <w:r>
+        <w:rPr>
+          <w:rFonts w:ascii="Georgia" w:eastAsia="Georgia" w:hAnsi="Georgia" w:cs="Georgia"/>
+          <w:color w:val="010101"/>
+          <w:sz w:val="22"/>
+          <w:szCs w:val="22"/>
+        </w:rPr>
+        <w:t>College Score</w:t>
+      </w:r>
+      <w:r>
+        <w:rPr>
+          <w:rFonts w:ascii="Georgia" w:eastAsia="Georgia" w:hAnsi="Georgia" w:cs="Georgia"/>
+          <w:color w:val="010101"/>
+          <w:sz w:val="22"/>
+          <w:szCs w:val="22"/>
+        </w:rPr>
+        <w:t>c</w:t>
+      </w:r>
+      <w:r>
+        <w:rPr>
+          <w:rFonts w:ascii="Georgia" w:eastAsia="Georgia" w:hAnsi="Georgia" w:cs="Georgia"/>
+          <w:color w:val="010101"/>
+          <w:sz w:val="22"/>
+          <w:szCs w:val="22"/>
+        </w:rPr>
+        <w:t>ard:</w:t>
+      </w:r>
+      <w:r>
+        <w:rPr>
+          <w:rFonts w:ascii="Georgia" w:eastAsia="Georgia" w:hAnsi="Georgia" w:cs="Georgia"/>
+          <w:color w:val="010101"/>
+          <w:sz w:val="22"/>
+          <w:szCs w:val="22"/>
+        </w:rPr>
+        <w:tab/>
+      </w:r>
+      <w:r>
+        <w:rPr>
+          <w:rFonts w:ascii="Georgia" w:eastAsia="Georgia" w:hAnsi="Georgia" w:cs="Georgia"/>
+          <w:color w:val="010101"/>
+          <w:sz w:val="22"/>
+          <w:szCs w:val="22"/>
+        </w:rPr>
+        <w:tab/>
+      </w:r>
+      <w:hyperlink r:id="rId10" w:history="1">
+        <w:r>
+          <w:rPr>
+            <w:rStyle w:val="Hyperlink"/>
+            <w:rFonts w:ascii="Georgia" w:eastAsia="Georgia" w:hAnsi="Georgia" w:cs="Georgia"/>
+            <w:sz w:val="22"/>
+            <w:szCs w:val="22"/>
+          </w:rPr>
+          <w:t>Data Home | College Scorecard</w:t>
+        </w:r>
+      </w:hyperlink>
+    </w:p>
+    <w:p>
+      <w:pPr>
+        <w:shd w:val="clear" w:color="auto" w:fill="FFFFFF"/>
+        <w:ind w:left="2880"/>
+        <w:rPr>
+          <w:rFonts w:ascii="Georgia" w:eastAsia="Georgia" w:hAnsi="Georgia" w:cs="Georgia"/>
+          <w:color w:val="010101"/>
+          <w:sz w:val="22"/>
+          <w:szCs w:val="22"/>
+        </w:rPr>
+      </w:pPr>
+      <w:r>
+        <w:rPr>
+          <w:rFonts w:ascii="Georgia" w:eastAsia="Georgia" w:hAnsi="Georgia" w:cs="Georgia"/>
+          <w:color w:val="010101"/>
+          <w:sz w:val="22"/>
+          <w:szCs w:val="22"/>
+        </w:rPr>
+        <w:t xml:space="preserve">This file contains </w:t>
+      </w:r>
+      <w:r>
+        <w:rPr>
+          <w:rFonts w:ascii="Georgia" w:eastAsia="Georgia" w:hAnsi="Georgia" w:cs="Georgia"/>
+          <w:color w:val="010101"/>
+          <w:sz w:val="22"/>
+          <w:szCs w:val="22"/>
+        </w:rPr>
+        <w:t>institution names, credential level, and median income three years after completion.</w:t>
+      </w:r>
+    </w:p>
+    <w:p>
+      <w:pPr>
+        <w:pStyle w:val="ListParagraph"/>
+        <w:numPr>
+          <w:ilvl w:val="0"/>
+          <w:numId w:val="9"/>
+        </w:numPr>
+        <w:shd w:val="clear" w:color="auto" w:fill="FFFFFF"/>
+        <w:rPr>
+          <w:rFonts w:ascii="Georgia" w:eastAsia="Georgia" w:hAnsi="Georgia" w:cs="Georgia"/>
+          <w:color w:val="010101"/>
+          <w:sz w:val="22"/>
+          <w:szCs w:val="22"/>
+        </w:rPr>
+      </w:pPr>
+      <w:r>
+        <w:rPr>
+          <w:rFonts w:ascii="Georgia" w:eastAsia="Georgia" w:hAnsi="Georgia" w:cs="Georgia"/>
+          <w:color w:val="010101"/>
+          <w:sz w:val="22"/>
+          <w:szCs w:val="22"/>
+        </w:rPr>
+        <w:t>Most-Recent-Cohort-Field-of-Study.csv</w:t>
+      </w:r>
+    </w:p>
+    <w:p>
+      <w:pPr>
+        <w:shd w:val="clear" w:color="auto" w:fill="FFFFFF"/>
+        <w:rPr>
+          <w:rFonts w:ascii="Georgia" w:eastAsia="Georgia" w:hAnsi="Georgia" w:cs="Georgia"/>
+          <w:color w:val="010101"/>
+          <w:sz w:val="22"/>
+          <w:szCs w:val="22"/>
+        </w:rPr>
+      </w:pPr>
+    </w:p>
+    <w:p>
+      <w:pPr>
+        <w:shd w:val="clear" w:color="auto" w:fill="FFFFFF"/>
+        <w:ind w:left="2160" w:firstLine="720"/>
+        <w:rPr>
+          <w:rFonts w:ascii="Georgia" w:eastAsia="Georgia" w:hAnsi="Georgia" w:cs="Georgia"/>
+          <w:color w:val="010101"/>
+          <w:sz w:val="22"/>
+          <w:szCs w:val="22"/>
+        </w:rPr>
+      </w:pPr>
+      <w:r>
+        <w:rPr>
+          <w:rFonts w:ascii="Georgia" w:eastAsia="Georgia" w:hAnsi="Georgia" w:cs="Georgia"/>
+          <w:color w:val="010101"/>
+          <w:sz w:val="22"/>
+          <w:szCs w:val="22"/>
+        </w:rPr>
+        <w:t xml:space="preserve">This file </w:t>
+      </w:r>
+      <w:r>
+        <w:rPr>
+          <w:rFonts w:ascii="Georgia" w:eastAsia="Georgia" w:hAnsi="Georgia" w:cs="Georgia"/>
+          <w:color w:val="010101"/>
+          <w:sz w:val="22"/>
+          <w:szCs w:val="22"/>
+        </w:rPr>
+        <w:t>contains</w:t>
+      </w:r>
+      <w:r>
+        <w:rPr>
+          <w:rFonts w:ascii="Georgia" w:eastAsia="Georgia" w:hAnsi="Georgia" w:cs="Georgia"/>
+          <w:color w:val="010101"/>
+          <w:sz w:val="22"/>
+          <w:szCs w:val="22"/>
+        </w:rPr>
+        <w:t xml:space="preserve"> </w:t>
+      </w:r>
+      <w:r>
+        <w:rPr>
+          <w:rFonts w:ascii="Georgia" w:eastAsia="Georgia" w:hAnsi="Georgia" w:cs="Georgia"/>
+          <w:color w:val="010101"/>
+          <w:sz w:val="22"/>
+          <w:szCs w:val="22"/>
+        </w:rPr>
+        <w:t>state abbreviations to filter for TN.</w:t>
+      </w:r>
+    </w:p>
+    <w:p>
+      <w:pPr>
+        <w:pStyle w:val="ListParagraph"/>
+        <w:numPr>
+          <w:ilvl w:val="0"/>
+          <w:numId w:val="9"/>
+        </w:numPr>
+        <w:shd w:val="clear" w:color="auto" w:fill="FFFFFF"/>
+        <w:rPr>
+          <w:rFonts w:ascii="Georgia" w:eastAsia="Georgia" w:hAnsi="Georgia" w:cs="Georgia"/>
+          <w:color w:val="010101"/>
+          <w:sz w:val="22"/>
+          <w:szCs w:val="22"/>
+        </w:rPr>
+      </w:pPr>
+      <w:r>
+        <w:rPr>
+          <w:rFonts w:ascii="Georgia" w:eastAsia="Georgia" w:hAnsi="Georgia" w:cs="Georgia"/>
+          <w:color w:val="010101"/>
+          <w:sz w:val="22"/>
+          <w:szCs w:val="22"/>
+        </w:rPr>
+        <w:t>Most-Recent-Cohort-Institution.csv</w:t>
+      </w:r>
+    </w:p>
+    <w:p>
+      <w:pPr>
+        <w:shd w:val="clear" w:color="auto" w:fill="FFFFFF"/>
+        <w:rPr>
+          <w:rFonts w:ascii="Georgia" w:eastAsia="Georgia" w:hAnsi="Georgia" w:cs="Georgia"/>
+          <w:color w:val="010101"/>
+          <w:sz w:val="22"/>
+          <w:szCs w:val="22"/>
+        </w:rPr>
+      </w:pPr>
+    </w:p>
+    <w:p>
+      <w:pPr>
+        <w:shd w:val="clear" w:color="auto" w:fill="FFFFFF"/>
+        <w:rPr>
+          <w:rFonts w:ascii="Georgia" w:eastAsia="Georgia" w:hAnsi="Georgia" w:cs="Georgia"/>
+          <w:color w:val="010101"/>
+          <w:sz w:val="22"/>
+          <w:szCs w:val="22"/>
+        </w:rPr>
+      </w:pPr>
+      <w:r>
+        <w:rPr>
+          <w:rFonts w:ascii="Georgia" w:eastAsia="Georgia" w:hAnsi="Georgia" w:cs="Georgia"/>
+          <w:sz w:val="22"/>
+          <w:szCs w:val="22"/>
+        </w:rPr>
+        <w:tab/>
+      </w:r>
+      <w:r>
+        <w:rPr>
+          <w:rFonts w:ascii="Georgia" w:eastAsia="Georgia" w:hAnsi="Georgia" w:cs="Georgia"/>
+          <w:sz w:val="22"/>
+          <w:szCs w:val="22"/>
+        </w:rPr>
+        <w:tab/>
+      </w:r>
+      <w:r>
+        <w:rPr>
+          <w:rFonts w:ascii="Georgia" w:eastAsia="Georgia" w:hAnsi="Georgia" w:cs="Georgia"/>
+          <w:sz w:val="22"/>
+          <w:szCs w:val="22"/>
+        </w:rPr>
+        <w:tab/>
+      </w:r>
+      <w:r>
+        <w:rPr>
+          <w:rFonts w:ascii="Georgia" w:eastAsia="Georgia" w:hAnsi="Georgia" w:cs="Georgia"/>
+          <w:sz w:val="22"/>
+          <w:szCs w:val="22"/>
+        </w:rPr>
+        <w:tab/>
       </w:r>
     </w:p>
     <w:p>
@@ -523,19 +2181,521 @@
           <w:rFonts w:ascii="Verdana" w:eastAsia="Verdana" w:hAnsi="Verdana" w:cs="Verdana"/>
           <w:b/>
           <w:color w:val="538135"/>
-          <w:sz w:val="38"/>
-          <w:szCs w:val="38"/>
-        </w:rPr>
-      </w:pPr>
+          <w:sz w:val="32"/>
+          <w:szCs w:val="32"/>
+        </w:rPr>
+      </w:pPr>
+      <w:proofErr w:type="gramStart"/>
       <w:r>
         <w:rPr>
           <w:rFonts w:ascii="Verdana" w:eastAsia="Verdana" w:hAnsi="Verdana" w:cs="Verdana"/>
           <w:b/>
           <w:color w:val="538135"/>
-          <w:sz w:val="38"/>
-          <w:szCs w:val="38"/>
-        </w:rPr>
-        <w:t>Known Issues and Challenges</w:t>
+          <w:sz w:val="32"/>
+          <w:szCs w:val="32"/>
+        </w:rPr>
+        <w:t>Known</w:t>
+      </w:r>
+      <w:proofErr w:type="gramEnd"/>
+      <w:r>
+        <w:rPr>
+          <w:rFonts w:ascii="Verdana" w:eastAsia="Verdana" w:hAnsi="Verdana" w:cs="Verdana"/>
+          <w:b/>
+          <w:color w:val="538135"/>
+          <w:sz w:val="32"/>
+          <w:szCs w:val="32"/>
+        </w:rPr>
+        <w:t xml:space="preserve"> Issues and Challenges</w:t>
+      </w:r>
+    </w:p>
+    <w:p>
+      <w:pPr>
+        <w:shd w:val="clear" w:color="auto" w:fill="FFFFFF"/>
+        <w:ind w:left="1440" w:hanging="1440"/>
+        <w:rPr>
+          <w:rFonts w:ascii="Georgia" w:eastAsia="Georgia" w:hAnsi="Georgia" w:cs="Georgia"/>
+          <w:color w:val="010101"/>
+          <w:sz w:val="22"/>
+          <w:szCs w:val="22"/>
+        </w:rPr>
+      </w:pPr>
+      <w:r>
+        <w:rPr>
+          <w:rFonts w:ascii="Georgia" w:eastAsia="Georgia" w:hAnsi="Georgia" w:cs="Georgia"/>
+          <w:color w:val="010101"/>
+          <w:sz w:val="22"/>
+          <w:szCs w:val="22"/>
+        </w:rPr>
+        <w:t>Challenge:</w:t>
+      </w:r>
+      <w:r>
+        <w:rPr>
+          <w:rFonts w:ascii="Georgia" w:eastAsia="Georgia" w:hAnsi="Georgia" w:cs="Georgia"/>
+          <w:color w:val="010101"/>
+          <w:sz w:val="22"/>
+          <w:szCs w:val="22"/>
+        </w:rPr>
+        <w:tab/>
+      </w:r>
+      <w:r>
+        <w:rPr>
+          <w:rFonts w:ascii="Georgia" w:eastAsia="Georgia" w:hAnsi="Georgia" w:cs="Georgia"/>
+          <w:color w:val="010101"/>
+          <w:sz w:val="22"/>
+          <w:szCs w:val="22"/>
+        </w:rPr>
+        <w:t>Credential levels and CIP codes are defined differently across IPEDS and College Scorecard</w:t>
+      </w:r>
+    </w:p>
+    <w:p>
+      <w:pPr>
+        <w:shd w:val="clear" w:color="auto" w:fill="FFFFFF"/>
+        <w:rPr>
+          <w:rFonts w:ascii="Georgia" w:eastAsia="Georgia" w:hAnsi="Georgia" w:cs="Georgia"/>
+          <w:color w:val="010101"/>
+          <w:sz w:val="22"/>
+          <w:szCs w:val="22"/>
+        </w:rPr>
+      </w:pPr>
+      <w:r>
+        <w:rPr>
+          <w:rFonts w:ascii="Georgia" w:eastAsia="Georgia" w:hAnsi="Georgia" w:cs="Georgia"/>
+          <w:color w:val="010101"/>
+          <w:sz w:val="22"/>
+          <w:szCs w:val="22"/>
+        </w:rPr>
+        <w:t>Solution:</w:t>
+      </w:r>
+      <w:r>
+        <w:rPr>
+          <w:rFonts w:ascii="Georgia" w:eastAsia="Georgia" w:hAnsi="Georgia" w:cs="Georgia"/>
+          <w:color w:val="010101"/>
+          <w:sz w:val="22"/>
+          <w:szCs w:val="22"/>
+        </w:rPr>
+        <w:tab/>
+      </w:r>
+      <w:r>
+        <w:rPr>
+          <w:rFonts w:ascii="Georgia" w:eastAsia="Georgia" w:hAnsi="Georgia" w:cs="Georgia"/>
+          <w:color w:val="010101"/>
+          <w:sz w:val="22"/>
+          <w:szCs w:val="22"/>
+        </w:rPr>
+        <w:t xml:space="preserve">Create a clear comparison and document </w:t>
+      </w:r>
+      <w:r>
+        <w:rPr>
+          <w:rFonts w:ascii="Georgia" w:eastAsia="Georgia" w:hAnsi="Georgia" w:cs="Georgia"/>
+          <w:color w:val="010101"/>
+          <w:sz w:val="22"/>
+          <w:szCs w:val="22"/>
+        </w:rPr>
+        <w:t>decisions</w:t>
+      </w:r>
+    </w:p>
+    <w:p>
+      <w:pPr>
+        <w:shd w:val="clear" w:color="auto" w:fill="FFFFFF"/>
+        <w:rPr>
+          <w:rFonts w:ascii="Georgia" w:eastAsia="Georgia" w:hAnsi="Georgia" w:cs="Georgia"/>
+          <w:color w:val="010101"/>
+          <w:sz w:val="22"/>
+          <w:szCs w:val="22"/>
+        </w:rPr>
+      </w:pPr>
+    </w:p>
+    <w:p>
+      <w:pPr>
+        <w:shd w:val="clear" w:color="auto" w:fill="FFFFFF"/>
+        <w:rPr>
+          <w:rFonts w:ascii="Georgia" w:eastAsia="Georgia" w:hAnsi="Georgia" w:cs="Georgia"/>
+          <w:color w:val="010101"/>
+          <w:sz w:val="22"/>
+          <w:szCs w:val="22"/>
+        </w:rPr>
+      </w:pPr>
+      <w:r>
+        <w:rPr>
+          <w:rFonts w:ascii="Georgia" w:eastAsia="Georgia" w:hAnsi="Georgia" w:cs="Georgia"/>
+          <w:color w:val="010101"/>
+          <w:sz w:val="22"/>
+          <w:szCs w:val="22"/>
+        </w:rPr>
+        <w:t>Challenge:</w:t>
+      </w:r>
+      <w:r>
+        <w:rPr>
+          <w:rFonts w:ascii="Georgia" w:eastAsia="Georgia" w:hAnsi="Georgia" w:cs="Georgia"/>
+          <w:color w:val="010101"/>
+          <w:sz w:val="22"/>
+          <w:szCs w:val="22"/>
+        </w:rPr>
+        <w:tab/>
+      </w:r>
+      <w:r>
+        <w:rPr>
+          <w:rFonts w:ascii="Georgia" w:eastAsia="Georgia" w:hAnsi="Georgia" w:cs="Georgia"/>
+          <w:color w:val="010101"/>
+          <w:sz w:val="22"/>
+          <w:szCs w:val="22"/>
+        </w:rPr>
+        <w:t>ROI Definition</w:t>
+      </w:r>
+    </w:p>
+    <w:p>
+      <w:pPr>
+        <w:shd w:val="clear" w:color="auto" w:fill="FFFFFF"/>
+        <w:ind w:left="1440" w:hanging="1440"/>
+        <w:rPr>
+          <w:rFonts w:ascii="Georgia" w:eastAsia="Georgia" w:hAnsi="Georgia" w:cs="Georgia"/>
+          <w:color w:val="010101"/>
+          <w:sz w:val="22"/>
+          <w:szCs w:val="22"/>
+        </w:rPr>
+      </w:pPr>
+      <w:r>
+        <w:rPr>
+          <w:rFonts w:ascii="Georgia" w:eastAsia="Georgia" w:hAnsi="Georgia" w:cs="Georgia"/>
+          <w:color w:val="010101"/>
+          <w:sz w:val="22"/>
+          <w:szCs w:val="22"/>
+        </w:rPr>
+        <w:t>Solution:</w:t>
+      </w:r>
+      <w:r>
+        <w:rPr>
+          <w:rFonts w:ascii="Georgia" w:eastAsia="Georgia" w:hAnsi="Georgia" w:cs="Georgia"/>
+          <w:color w:val="010101"/>
+          <w:sz w:val="22"/>
+          <w:szCs w:val="22"/>
+        </w:rPr>
+        <w:tab/>
+      </w:r>
+      <w:r>
+        <w:rPr>
+          <w:rFonts w:ascii="Georgia" w:eastAsia="Georgia" w:hAnsi="Georgia" w:cs="Georgia"/>
+          <w:color w:val="010101"/>
+          <w:sz w:val="22"/>
+          <w:szCs w:val="22"/>
+        </w:rPr>
+        <w:t>The data includes length</w:t>
+      </w:r>
+      <w:r>
+        <w:rPr>
+          <w:rFonts w:ascii="Georgia" w:eastAsia="Georgia" w:hAnsi="Georgia" w:cs="Georgia"/>
+          <w:color w:val="010101"/>
+          <w:sz w:val="22"/>
+          <w:szCs w:val="22"/>
+        </w:rPr>
+        <w:t xml:space="preserve"> and</w:t>
+      </w:r>
+      <w:r>
+        <w:rPr>
+          <w:rFonts w:ascii="Georgia" w:eastAsia="Georgia" w:hAnsi="Georgia" w:cs="Georgia"/>
+          <w:color w:val="010101"/>
+          <w:sz w:val="22"/>
+          <w:szCs w:val="22"/>
+        </w:rPr>
+        <w:t xml:space="preserve"> </w:t>
+      </w:r>
+      <w:r>
+        <w:rPr>
+          <w:rFonts w:ascii="Georgia" w:eastAsia="Georgia" w:hAnsi="Georgia" w:cs="Georgia"/>
+          <w:color w:val="010101"/>
+          <w:sz w:val="22"/>
+          <w:szCs w:val="22"/>
+        </w:rPr>
+        <w:t xml:space="preserve">average </w:t>
+      </w:r>
+      <w:r>
+        <w:rPr>
+          <w:rFonts w:ascii="Georgia" w:eastAsia="Georgia" w:hAnsi="Georgia" w:cs="Georgia"/>
+          <w:color w:val="010101"/>
+          <w:sz w:val="22"/>
+          <w:szCs w:val="22"/>
+        </w:rPr>
+        <w:t xml:space="preserve">cost of </w:t>
+      </w:r>
+      <w:r>
+        <w:rPr>
+          <w:rFonts w:ascii="Georgia" w:eastAsia="Georgia" w:hAnsi="Georgia" w:cs="Georgia"/>
+          <w:color w:val="010101"/>
+          <w:sz w:val="22"/>
+          <w:szCs w:val="22"/>
+        </w:rPr>
+        <w:t>program</w:t>
+      </w:r>
+      <w:r>
+        <w:rPr>
+          <w:rFonts w:ascii="Georgia" w:eastAsia="Georgia" w:hAnsi="Georgia" w:cs="Georgia"/>
+          <w:color w:val="010101"/>
+          <w:sz w:val="22"/>
+          <w:szCs w:val="22"/>
+        </w:rPr>
+        <w:t>s</w:t>
+      </w:r>
+      <w:r>
+        <w:rPr>
+          <w:rFonts w:ascii="Georgia" w:eastAsia="Georgia" w:hAnsi="Georgia" w:cs="Georgia"/>
+          <w:color w:val="010101"/>
+          <w:sz w:val="22"/>
+          <w:szCs w:val="22"/>
+        </w:rPr>
+        <w:t xml:space="preserve"> but</w:t>
+      </w:r>
+      <w:r>
+        <w:rPr>
+          <w:rFonts w:ascii="Georgia" w:eastAsia="Georgia" w:hAnsi="Georgia" w:cs="Georgia"/>
+          <w:color w:val="010101"/>
+          <w:sz w:val="22"/>
+          <w:szCs w:val="22"/>
+        </w:rPr>
+        <w:t xml:space="preserve"> does not </w:t>
+      </w:r>
+      <w:r>
+        <w:rPr>
+          <w:rFonts w:ascii="Georgia" w:eastAsia="Georgia" w:hAnsi="Georgia" w:cs="Georgia"/>
+          <w:color w:val="010101"/>
+          <w:sz w:val="22"/>
+          <w:szCs w:val="22"/>
+        </w:rPr>
+        <w:t>consider</w:t>
+      </w:r>
+      <w:r>
+        <w:rPr>
+          <w:rFonts w:ascii="Georgia" w:eastAsia="Georgia" w:hAnsi="Georgia" w:cs="Georgia"/>
+          <w:color w:val="010101"/>
+          <w:sz w:val="22"/>
+          <w:szCs w:val="22"/>
+        </w:rPr>
+        <w:t xml:space="preserve"> </w:t>
+      </w:r>
+      <w:r>
+        <w:rPr>
+          <w:rFonts w:ascii="Georgia" w:eastAsia="Georgia" w:hAnsi="Georgia" w:cs="Georgia"/>
+          <w:color w:val="010101"/>
+          <w:sz w:val="22"/>
+          <w:szCs w:val="22"/>
+        </w:rPr>
+        <w:t>loan debt or working status during the program.</w:t>
+      </w:r>
+    </w:p>
+    <w:p>
+      <w:pPr>
+        <w:shd w:val="clear" w:color="auto" w:fill="FFFFFF"/>
+        <w:ind w:left="1440" w:hanging="1440"/>
+        <w:rPr>
+          <w:rFonts w:ascii="Georgia" w:eastAsia="Georgia" w:hAnsi="Georgia" w:cs="Georgia"/>
+          <w:color w:val="010101"/>
+          <w:sz w:val="22"/>
+          <w:szCs w:val="22"/>
+        </w:rPr>
+      </w:pPr>
+    </w:p>
+    <w:p>
+      <w:pPr>
+        <w:shd w:val="clear" w:color="auto" w:fill="FFFFFF"/>
+        <w:ind w:left="1440" w:hanging="1440"/>
+        <w:rPr>
+          <w:rFonts w:ascii="Georgia" w:eastAsia="Georgia" w:hAnsi="Georgia" w:cs="Georgia"/>
+          <w:color w:val="010101"/>
+          <w:sz w:val="22"/>
+          <w:szCs w:val="22"/>
+        </w:rPr>
+      </w:pPr>
+      <w:r>
+        <w:rPr>
+          <w:rFonts w:ascii="Georgia" w:eastAsia="Georgia" w:hAnsi="Georgia" w:cs="Georgia"/>
+          <w:color w:val="010101"/>
+          <w:sz w:val="22"/>
+          <w:szCs w:val="22"/>
+        </w:rPr>
+        <w:t>Challenge:</w:t>
+      </w:r>
+      <w:r>
+        <w:rPr>
+          <w:rFonts w:ascii="Georgia" w:eastAsia="Georgia" w:hAnsi="Georgia" w:cs="Georgia"/>
+          <w:color w:val="010101"/>
+          <w:sz w:val="22"/>
+          <w:szCs w:val="22"/>
+        </w:rPr>
+        <w:tab/>
+      </w:r>
+      <w:r>
+        <w:rPr>
+          <w:rFonts w:ascii="Georgia" w:eastAsia="Georgia" w:hAnsi="Georgia" w:cs="Georgia"/>
+          <w:color w:val="010101"/>
+          <w:sz w:val="22"/>
+          <w:szCs w:val="22"/>
+        </w:rPr>
+        <w:t>P</w:t>
+      </w:r>
+      <w:r>
+        <w:rPr>
+          <w:rFonts w:ascii="Georgia" w:eastAsia="Georgia" w:hAnsi="Georgia" w:cs="Georgia"/>
+          <w:color w:val="010101"/>
+          <w:sz w:val="22"/>
+          <w:szCs w:val="22"/>
+        </w:rPr>
+        <w:t xml:space="preserve">rogram completion may </w:t>
+      </w:r>
+      <w:r>
+        <w:rPr>
+          <w:rFonts w:ascii="Georgia" w:eastAsia="Georgia" w:hAnsi="Georgia" w:cs="Georgia"/>
+          <w:color w:val="010101"/>
+          <w:sz w:val="22"/>
+          <w:szCs w:val="22"/>
+        </w:rPr>
+        <w:t xml:space="preserve">occur after </w:t>
+      </w:r>
+      <w:r>
+        <w:rPr>
+          <w:rFonts w:ascii="Georgia" w:eastAsia="Georgia" w:hAnsi="Georgia" w:cs="Georgia"/>
+          <w:color w:val="010101"/>
+          <w:sz w:val="22"/>
+          <w:szCs w:val="22"/>
+        </w:rPr>
+        <w:t>completion of another</w:t>
+      </w:r>
+      <w:r>
+        <w:rPr>
+          <w:rFonts w:ascii="Georgia" w:eastAsia="Georgia" w:hAnsi="Georgia" w:cs="Georgia"/>
+          <w:color w:val="010101"/>
+          <w:sz w:val="22"/>
+          <w:szCs w:val="22"/>
+        </w:rPr>
+        <w:t xml:space="preserve"> program. For example, a Short Certificate </w:t>
+      </w:r>
+      <w:r>
+        <w:rPr>
+          <w:rFonts w:ascii="Georgia" w:eastAsia="Georgia" w:hAnsi="Georgia" w:cs="Georgia"/>
+          <w:color w:val="010101"/>
+          <w:sz w:val="22"/>
+          <w:szCs w:val="22"/>
+        </w:rPr>
+        <w:t xml:space="preserve">program may occur after a </w:t>
+      </w:r>
+      <w:r>
+        <w:rPr>
+          <w:rFonts w:ascii="Georgia" w:eastAsia="Georgia" w:hAnsi="Georgia" w:cs="Georgia"/>
+          <w:color w:val="010101"/>
+          <w:sz w:val="22"/>
+          <w:szCs w:val="22"/>
+        </w:rPr>
+        <w:t>bachelor’s</w:t>
+      </w:r>
+      <w:r>
+        <w:rPr>
+          <w:rFonts w:ascii="Georgia" w:eastAsia="Georgia" w:hAnsi="Georgia" w:cs="Georgia"/>
+          <w:color w:val="010101"/>
+          <w:sz w:val="22"/>
+          <w:szCs w:val="22"/>
+        </w:rPr>
+        <w:t xml:space="preserve"> has already been earned.</w:t>
+      </w:r>
+    </w:p>
+    <w:p>
+      <w:pPr>
+        <w:shd w:val="clear" w:color="auto" w:fill="FFFFFF"/>
+        <w:ind w:left="1440" w:hanging="1440"/>
+        <w:rPr>
+          <w:rFonts w:ascii="Georgia" w:eastAsia="Georgia" w:hAnsi="Georgia" w:cs="Georgia"/>
+          <w:color w:val="010101"/>
+          <w:sz w:val="22"/>
+          <w:szCs w:val="22"/>
+        </w:rPr>
+      </w:pPr>
+      <w:r>
+        <w:rPr>
+          <w:rFonts w:ascii="Georgia" w:eastAsia="Georgia" w:hAnsi="Georgia" w:cs="Georgia"/>
+          <w:color w:val="010101"/>
+          <w:sz w:val="22"/>
+          <w:szCs w:val="22"/>
+        </w:rPr>
+        <w:t>Solution:</w:t>
+      </w:r>
+      <w:r>
+        <w:rPr>
+          <w:rFonts w:ascii="Georgia" w:eastAsia="Georgia" w:hAnsi="Georgia" w:cs="Georgia"/>
+          <w:color w:val="010101"/>
+          <w:sz w:val="22"/>
+          <w:szCs w:val="22"/>
+        </w:rPr>
+        <w:tab/>
+        <w:t>The</w:t>
+      </w:r>
+      <w:r>
+        <w:rPr>
+          <w:rFonts w:ascii="Georgia" w:eastAsia="Georgia" w:hAnsi="Georgia" w:cs="Georgia"/>
+          <w:color w:val="010101"/>
+          <w:sz w:val="22"/>
+          <w:szCs w:val="22"/>
+        </w:rPr>
+        <w:t xml:space="preserve"> only data available is aggregated, the</w:t>
+      </w:r>
+      <w:r>
+        <w:rPr>
+          <w:rFonts w:ascii="Georgia" w:eastAsia="Georgia" w:hAnsi="Georgia" w:cs="Georgia"/>
+          <w:color w:val="010101"/>
+          <w:sz w:val="22"/>
+          <w:szCs w:val="22"/>
+        </w:rPr>
+        <w:t xml:space="preserve">refore there is no way to verify if the completions in </w:t>
+      </w:r>
+      <w:r>
+        <w:rPr>
+          <w:rFonts w:ascii="Georgia" w:eastAsia="Georgia" w:hAnsi="Georgia" w:cs="Georgia"/>
+          <w:color w:val="010101"/>
+          <w:sz w:val="22"/>
+          <w:szCs w:val="22"/>
+        </w:rPr>
+        <w:t>the</w:t>
+      </w:r>
+      <w:r>
+        <w:rPr>
+          <w:rFonts w:ascii="Georgia" w:eastAsia="Georgia" w:hAnsi="Georgia" w:cs="Georgia"/>
+          <w:color w:val="010101"/>
+          <w:sz w:val="22"/>
+          <w:szCs w:val="22"/>
+        </w:rPr>
+        <w:t xml:space="preserve"> data have prior </w:t>
+      </w:r>
+      <w:r>
+        <w:rPr>
+          <w:rFonts w:ascii="Georgia" w:eastAsia="Georgia" w:hAnsi="Georgia" w:cs="Georgia"/>
+          <w:color w:val="010101"/>
+          <w:sz w:val="22"/>
+          <w:szCs w:val="22"/>
+        </w:rPr>
+        <w:t>completions</w:t>
+      </w:r>
+      <w:r>
+        <w:rPr>
+          <w:rFonts w:ascii="Georgia" w:eastAsia="Georgia" w:hAnsi="Georgia" w:cs="Georgia"/>
+          <w:color w:val="010101"/>
+          <w:sz w:val="22"/>
+          <w:szCs w:val="22"/>
+        </w:rPr>
+        <w:t xml:space="preserve"> of any type.</w:t>
+      </w:r>
+      <w:r>
+        <w:rPr>
+          <w:rFonts w:ascii="Georgia" w:eastAsia="Georgia" w:hAnsi="Georgia" w:cs="Georgia"/>
+          <w:color w:val="010101"/>
+          <w:sz w:val="22"/>
+          <w:szCs w:val="22"/>
+        </w:rPr>
+        <w:t xml:space="preserve"> </w:t>
+      </w:r>
+      <w:r>
+        <w:rPr>
+          <w:rFonts w:ascii="Georgia" w:eastAsia="Georgia" w:hAnsi="Georgia" w:cs="Georgia"/>
+          <w:color w:val="010101"/>
+          <w:sz w:val="22"/>
+          <w:szCs w:val="22"/>
+        </w:rPr>
+        <w:t xml:space="preserve"> </w:t>
       </w:r>
     </w:p>
     <w:p>
@@ -545,95 +2705,52 @@
           <w:rFonts w:ascii="Georgia" w:eastAsia="Georgia" w:hAnsi="Georgia" w:cs="Georgia"/>
           <w:i/>
           <w:color w:val="010101"/>
-        </w:rPr>
-      </w:pPr>
-      <w:r>
+          <w:sz w:val="22"/>
+          <w:szCs w:val="22"/>
+        </w:rPr>
+      </w:pPr>
+    </w:p>
+    <w:p>
+      <w:pPr>
+        <w:shd w:val="clear" w:color="auto" w:fill="FFFFFF"/>
         <w:rPr>
           <w:rFonts w:ascii="Georgia" w:eastAsia="Georgia" w:hAnsi="Georgia" w:cs="Georgia"/>
           <w:i/>
           <w:color w:val="010101"/>
-        </w:rPr>
-        <w:t>Explain any anticipated challenges with your project, and your plan for managing them. Be sure to include:</w:t>
-      </w:r>
-    </w:p>
-    <w:p>
-      <w:pPr>
-        <w:numPr>
-          <w:ilvl w:val="0"/>
-          <w:numId w:val="3"/>
-        </w:numPr>
+          <w:sz w:val="22"/>
+          <w:szCs w:val="22"/>
+        </w:rPr>
+      </w:pPr>
+    </w:p>
+    <w:p>
+      <w:pPr>
         <w:shd w:val="clear" w:color="auto" w:fill="FFFFFF"/>
         <w:rPr>
           <w:rFonts w:ascii="Georgia" w:eastAsia="Georgia" w:hAnsi="Georgia" w:cs="Georgia"/>
           <w:i/>
           <w:color w:val="010101"/>
-        </w:rPr>
-      </w:pPr>
-      <w:r>
-        <w:rPr>
-          <w:rFonts w:ascii="Georgia" w:eastAsia="Georgia" w:hAnsi="Georgia" w:cs="Georgia"/>
-          <w:i/>
-          <w:color w:val="010101"/>
-        </w:rPr>
-        <w:t xml:space="preserve">If you need to request data or an </w:t>
-      </w:r>
-      <w:proofErr w:type="spellStart"/>
-      <w:r>
-        <w:rPr>
-          <w:rFonts w:ascii="Georgia" w:eastAsia="Georgia" w:hAnsi="Georgia" w:cs="Georgia"/>
-          <w:i/>
-          <w:color w:val="010101"/>
-        </w:rPr>
-        <w:t>api</w:t>
-      </w:r>
-      <w:proofErr w:type="spellEnd"/>
-      <w:r>
-        <w:rPr>
-          <w:rFonts w:ascii="Georgia" w:eastAsia="Georgia" w:hAnsi="Georgia" w:cs="Georgia"/>
-          <w:i/>
-          <w:color w:val="010101"/>
-        </w:rPr>
-        <w:t xml:space="preserve"> key</w:t>
-      </w:r>
-    </w:p>
-    <w:p>
-      <w:pPr>
-        <w:numPr>
-          <w:ilvl w:val="0"/>
-          <w:numId w:val="3"/>
-        </w:numPr>
-        <w:shd w:val="clear" w:color="auto" w:fill="FFFFFF"/>
-        <w:rPr>
-          <w:rFonts w:ascii="Georgia" w:eastAsia="Georgia" w:hAnsi="Georgia" w:cs="Georgia"/>
-          <w:i/>
-          <w:color w:val="010101"/>
-        </w:rPr>
-      </w:pPr>
-      <w:r>
-        <w:rPr>
-          <w:rFonts w:ascii="Georgia" w:eastAsia="Georgia" w:hAnsi="Georgia" w:cs="Georgia"/>
-          <w:i/>
-          <w:color w:val="010101"/>
-        </w:rPr>
-        <w:t>Based on your data sources, known data cleaning steps</w:t>
-      </w:r>
+          <w:sz w:val="22"/>
+          <w:szCs w:val="22"/>
+        </w:rPr>
+      </w:pPr>
     </w:p>
     <w:sectPr>
       <w:pgSz w:w="12240" w:h="15840"/>
       <w:pgMar w:top="1440" w:right="1440" w:bottom="1440" w:left="1440" w:header="720" w:footer="720" w:gutter="0"/>
       <w:pgNumType w:start="1"/>
       <w:cols w:space="720"/>
+      <w:docGrid w:linePitch="326"/>
     </w:sectPr>
   </w:body>
 </w:document>
 </file>
 
 <file path=word/numbering.xml><?xml version="1.0" encoding="utf-8"?>
-<w:numbering xmlns:wpc="http://schemas.microsoft.com/office/word/2010/wordprocessingCanvas" xmlns:cx="http://schemas.microsoft.com/office/drawing/2014/chartex" xmlns:cx1="http://schemas.microsoft.com/office/drawing/2015/9/8/chartex" xmlns:cx2="http://schemas.microsoft.com/office/drawing/2015/10/21/chartex" xmlns:cx3="http://schemas.microsoft.com/office/drawing/2016/5/9/chartex" xmlns:cx4="http://schemas.microsoft.com/office/drawing/2016/5/10/chartex" xmlns:cx5="http://schemas.microsoft.com/office/drawing/2016/5/11/chartex" xmlns:cx6="http://schemas.microsoft.com/office/drawing/2016/5/12/chartex" xmlns:cx7="http://schemas.microsoft.com/office/drawing/2016/5/13/chartex" xmlns:cx8="http://schemas.microsoft.com/office/drawing/2016/5/14/chartex" xmlns:mc="http://schemas.openxmlformats.org/markup-compatibility/2006" xmlns:aink="http://schemas.microsoft.com/office/drawing/2016/ink" xmlns:am3d="http://schemas.microsoft.com/office/drawing/2017/model3d" xmlns:o="urn:schemas-microsoft-com:office:office" xmlns:oel="http://schemas.microsoft.com/office/2019/extlst" xmlns:r="http://schemas.openxmlformats.org/officeDocument/2006/relationships" xmlns:m="http://schemas.openxmlformats.org/officeDocument/2006/math" xmlns:v="urn:schemas-microsoft-com:vml" xmlns:wp14="http://schemas.microsoft.com/office/word/2010/wordprocessingDrawing" xmlns:wp="http://schemas.openxmlformats.org/drawingml/2006/wordprocessingDrawing" xmlns:w10="urn:schemas-microsoft-com:office:word" xmlns:w="http://schemas.openxmlformats.org/wordprocessingml/2006/main" xmlns:w14="http://schemas.microsoft.com/office/word/2010/wordml" xmlns:w15="http://schemas.microsoft.com/office/word/2012/wordml" xmlns:w16cex="http://schemas.microsoft.com/office/word/2018/wordml/cex" xmlns:w16cid="http://schemas.microsoft.com/office/word/2016/wordml/cid" xmlns:w16="http://schemas.microsoft.com/office/word/2018/wordml" xmlns:w16du="http://schemas.microsoft.com/office/word/2023/wordml/word16du" xmlns:w16sdtdh="http://schemas.microsoft.com/office/word/2020/wordml/sdtdatahash" xmlns:w16se="http://schemas.microsoft.com/office/word/2015/wordml/symex" xmlns:wpg="http://schemas.microsoft.com/office/word/2010/wordprocessingGroup" xmlns:wpi="http://schemas.microsoft.com/office/word/2010/wordprocessingInk" xmlns:wne="http://schemas.microsoft.com/office/word/2006/wordml" xmlns:wps="http://schemas.microsoft.com/office/word/2010/wordprocessingShape" mc:Ignorable="w14 w15 w16se w16cid w16 w16cex w16sdtdh w16du wp14">
+<w:numbering xmlns:wpc="http://schemas.microsoft.com/office/word/2010/wordprocessingCanvas" xmlns:cx="http://schemas.microsoft.com/office/drawing/2014/chartex" xmlns:cx1="http://schemas.microsoft.com/office/drawing/2015/9/8/chartex" xmlns:cx2="http://schemas.microsoft.com/office/drawing/2015/10/21/chartex" xmlns:cx3="http://schemas.microsoft.com/office/drawing/2016/5/9/chartex" xmlns:cx4="http://schemas.microsoft.com/office/drawing/2016/5/10/chartex" xmlns:cx5="http://schemas.microsoft.com/office/drawing/2016/5/11/chartex" xmlns:cx6="http://schemas.microsoft.com/office/drawing/2016/5/12/chartex" xmlns:cx7="http://schemas.microsoft.com/office/drawing/2016/5/13/chartex" xmlns:cx8="http://schemas.microsoft.com/office/drawing/2016/5/14/chartex" xmlns:mc="http://schemas.openxmlformats.org/markup-compatibility/2006" xmlns:aink="http://schemas.microsoft.com/office/drawing/2016/ink" xmlns:am3d="http://schemas.microsoft.com/office/drawing/2017/model3d" xmlns:o="urn:schemas-microsoft-com:office:office" xmlns:oel="http://schemas.microsoft.com/office/2019/extlst" xmlns:r="http://schemas.openxmlformats.org/officeDocument/2006/relationships" xmlns:m="http://schemas.openxmlformats.org/officeDocument/2006/math" xmlns:v="urn:schemas-microsoft-com:vml" xmlns:wp14="http://schemas.microsoft.com/office/word/2010/wordprocessingDrawing" xmlns:wp="http://schemas.openxmlformats.org/drawingml/2006/wordprocessingDrawing" xmlns:w10="urn:schemas-microsoft-com:office:word" xmlns:w="http://schemas.openxmlformats.org/wordprocessingml/2006/main" xmlns:w14="http://schemas.microsoft.com/office/word/2010/wordml" xmlns:w15="http://schemas.microsoft.com/office/word/2012/wordml" xmlns:w16cex="http://schemas.microsoft.com/office/word/2018/wordml/cex" xmlns:w16cid="http://schemas.microsoft.com/office/word/2016/wordml/cid" xmlns:w16="http://schemas.microsoft.com/office/word/2018/wordml" xmlns:w16du="http://schemas.microsoft.com/office/word/2023/wordml/word16du" xmlns:w16sdtdh="http://schemas.microsoft.com/office/word/2020/wordml/sdtdatahash" xmlns:w16sdtfl="http://schemas.microsoft.com/office/word/2024/wordml/sdtformatlock" xmlns:w16se="http://schemas.microsoft.com/office/word/2015/wordml/symex" xmlns:wpg="http://schemas.microsoft.com/office/word/2010/wordprocessingGroup" xmlns:wpi="http://schemas.microsoft.com/office/word/2010/wordprocessingInk" xmlns:wne="http://schemas.microsoft.com/office/word/2006/wordml" xmlns:wps="http://schemas.microsoft.com/office/word/2010/wordprocessingShape" mc:Ignorable="w14 w15 w16se w16cid w16 w16cex w16sdtdh w16sdtfl w16du wp14">
   <w:abstractNum w:abstractNumId="0" w15:restartNumberingAfterBreak="0">
-    <w:nsid w:val="1AE44376"/>
+    <w:nsid w:val="19F87628"/>
     <w:multiLevelType w:val="multilevel"/>
-    <w:tmpl w:val="B5728DDA"/>
+    <w:tmpl w:val="31A03152"/>
     <w:lvl w:ilvl="0">
       <w:start w:val="1"/>
       <w:numFmt w:val="decimal"/>
@@ -717,9 +2834,461 @@
     </w:lvl>
   </w:abstractNum>
   <w:abstractNum w:abstractNumId="1" w15:restartNumberingAfterBreak="0">
-    <w:nsid w:val="6D5944C9"/>
+    <w:nsid w:val="1A062057"/>
+    <w:multiLevelType w:val="hybridMultilevel"/>
+    <w:tmpl w:val="ACD4C55C"/>
+    <w:lvl w:ilvl="0" w:tplc="04090001">
+      <w:start w:val="1"/>
+      <w:numFmt w:val="bullet"/>
+      <w:lvlText w:val=""/>
+      <w:lvlJc w:val="left"/>
+      <w:pPr>
+        <w:ind w:left="720" w:hanging="360"/>
+      </w:pPr>
+      <w:rPr>
+        <w:rFonts w:ascii="Symbol" w:hAnsi="Symbol" w:hint="default"/>
+      </w:rPr>
+    </w:lvl>
+    <w:lvl w:ilvl="1" w:tplc="04090003">
+      <w:start w:val="1"/>
+      <w:numFmt w:val="bullet"/>
+      <w:lvlText w:val="o"/>
+      <w:lvlJc w:val="left"/>
+      <w:pPr>
+        <w:ind w:left="1440" w:hanging="360"/>
+      </w:pPr>
+      <w:rPr>
+        <w:rFonts w:ascii="Courier New" w:hAnsi="Courier New" w:cs="Courier New" w:hint="default"/>
+      </w:rPr>
+    </w:lvl>
+    <w:lvl w:ilvl="2" w:tplc="04090005" w:tentative="1">
+      <w:start w:val="1"/>
+      <w:numFmt w:val="bullet"/>
+      <w:lvlText w:val=""/>
+      <w:lvlJc w:val="left"/>
+      <w:pPr>
+        <w:ind w:left="2160" w:hanging="360"/>
+      </w:pPr>
+      <w:rPr>
+        <w:rFonts w:ascii="Wingdings" w:hAnsi="Wingdings" w:hint="default"/>
+      </w:rPr>
+    </w:lvl>
+    <w:lvl w:ilvl="3" w:tplc="04090001" w:tentative="1">
+      <w:start w:val="1"/>
+      <w:numFmt w:val="bullet"/>
+      <w:lvlText w:val=""/>
+      <w:lvlJc w:val="left"/>
+      <w:pPr>
+        <w:ind w:left="2880" w:hanging="360"/>
+      </w:pPr>
+      <w:rPr>
+        <w:rFonts w:ascii="Symbol" w:hAnsi="Symbol" w:hint="default"/>
+      </w:rPr>
+    </w:lvl>
+    <w:lvl w:ilvl="4" w:tplc="04090003" w:tentative="1">
+      <w:start w:val="1"/>
+      <w:numFmt w:val="bullet"/>
+      <w:lvlText w:val="o"/>
+      <w:lvlJc w:val="left"/>
+      <w:pPr>
+        <w:ind w:left="3600" w:hanging="360"/>
+      </w:pPr>
+      <w:rPr>
+        <w:rFonts w:ascii="Courier New" w:hAnsi="Courier New" w:cs="Courier New" w:hint="default"/>
+      </w:rPr>
+    </w:lvl>
+    <w:lvl w:ilvl="5" w:tplc="04090005" w:tentative="1">
+      <w:start w:val="1"/>
+      <w:numFmt w:val="bullet"/>
+      <w:lvlText w:val=""/>
+      <w:lvlJc w:val="left"/>
+      <w:pPr>
+        <w:ind w:left="4320" w:hanging="360"/>
+      </w:pPr>
+      <w:rPr>
+        <w:rFonts w:ascii="Wingdings" w:hAnsi="Wingdings" w:hint="default"/>
+      </w:rPr>
+    </w:lvl>
+    <w:lvl w:ilvl="6" w:tplc="04090001" w:tentative="1">
+      <w:start w:val="1"/>
+      <w:numFmt w:val="bullet"/>
+      <w:lvlText w:val=""/>
+      <w:lvlJc w:val="left"/>
+      <w:pPr>
+        <w:ind w:left="5040" w:hanging="360"/>
+      </w:pPr>
+      <w:rPr>
+        <w:rFonts w:ascii="Symbol" w:hAnsi="Symbol" w:hint="default"/>
+      </w:rPr>
+    </w:lvl>
+    <w:lvl w:ilvl="7" w:tplc="04090003" w:tentative="1">
+      <w:start w:val="1"/>
+      <w:numFmt w:val="bullet"/>
+      <w:lvlText w:val="o"/>
+      <w:lvlJc w:val="left"/>
+      <w:pPr>
+        <w:ind w:left="5760" w:hanging="360"/>
+      </w:pPr>
+      <w:rPr>
+        <w:rFonts w:ascii="Courier New" w:hAnsi="Courier New" w:cs="Courier New" w:hint="default"/>
+      </w:rPr>
+    </w:lvl>
+    <w:lvl w:ilvl="8" w:tplc="04090005" w:tentative="1">
+      <w:start w:val="1"/>
+      <w:numFmt w:val="bullet"/>
+      <w:lvlText w:val=""/>
+      <w:lvlJc w:val="left"/>
+      <w:pPr>
+        <w:ind w:left="6480" w:hanging="360"/>
+      </w:pPr>
+      <w:rPr>
+        <w:rFonts w:ascii="Wingdings" w:hAnsi="Wingdings" w:hint="default"/>
+      </w:rPr>
+    </w:lvl>
+  </w:abstractNum>
+  <w:abstractNum w:abstractNumId="2" w15:restartNumberingAfterBreak="0">
+    <w:nsid w:val="1B6761E8"/>
+    <w:multiLevelType w:val="hybridMultilevel"/>
+    <w:tmpl w:val="9EA21FE0"/>
+    <w:lvl w:ilvl="0" w:tplc="04090001">
+      <w:start w:val="1"/>
+      <w:numFmt w:val="bullet"/>
+      <w:lvlText w:val=""/>
+      <w:lvlJc w:val="left"/>
+      <w:pPr>
+        <w:ind w:left="720" w:hanging="360"/>
+      </w:pPr>
+      <w:rPr>
+        <w:rFonts w:ascii="Symbol" w:hAnsi="Symbol" w:hint="default"/>
+      </w:rPr>
+    </w:lvl>
+    <w:lvl w:ilvl="1" w:tplc="04090003" w:tentative="1">
+      <w:start w:val="1"/>
+      <w:numFmt w:val="bullet"/>
+      <w:lvlText w:val="o"/>
+      <w:lvlJc w:val="left"/>
+      <w:pPr>
+        <w:ind w:left="1440" w:hanging="360"/>
+      </w:pPr>
+      <w:rPr>
+        <w:rFonts w:ascii="Courier New" w:hAnsi="Courier New" w:cs="Courier New" w:hint="default"/>
+      </w:rPr>
+    </w:lvl>
+    <w:lvl w:ilvl="2" w:tplc="04090005" w:tentative="1">
+      <w:start w:val="1"/>
+      <w:numFmt w:val="bullet"/>
+      <w:lvlText w:val=""/>
+      <w:lvlJc w:val="left"/>
+      <w:pPr>
+        <w:ind w:left="2160" w:hanging="360"/>
+      </w:pPr>
+      <w:rPr>
+        <w:rFonts w:ascii="Wingdings" w:hAnsi="Wingdings" w:hint="default"/>
+      </w:rPr>
+    </w:lvl>
+    <w:lvl w:ilvl="3" w:tplc="04090001" w:tentative="1">
+      <w:start w:val="1"/>
+      <w:numFmt w:val="bullet"/>
+      <w:lvlText w:val=""/>
+      <w:lvlJc w:val="left"/>
+      <w:pPr>
+        <w:ind w:left="2880" w:hanging="360"/>
+      </w:pPr>
+      <w:rPr>
+        <w:rFonts w:ascii="Symbol" w:hAnsi="Symbol" w:hint="default"/>
+      </w:rPr>
+    </w:lvl>
+    <w:lvl w:ilvl="4" w:tplc="04090003" w:tentative="1">
+      <w:start w:val="1"/>
+      <w:numFmt w:val="bullet"/>
+      <w:lvlText w:val="o"/>
+      <w:lvlJc w:val="left"/>
+      <w:pPr>
+        <w:ind w:left="3600" w:hanging="360"/>
+      </w:pPr>
+      <w:rPr>
+        <w:rFonts w:ascii="Courier New" w:hAnsi="Courier New" w:cs="Courier New" w:hint="default"/>
+      </w:rPr>
+    </w:lvl>
+    <w:lvl w:ilvl="5" w:tplc="04090005" w:tentative="1">
+      <w:start w:val="1"/>
+      <w:numFmt w:val="bullet"/>
+      <w:lvlText w:val=""/>
+      <w:lvlJc w:val="left"/>
+      <w:pPr>
+        <w:ind w:left="4320" w:hanging="360"/>
+      </w:pPr>
+      <w:rPr>
+        <w:rFonts w:ascii="Wingdings" w:hAnsi="Wingdings" w:hint="default"/>
+      </w:rPr>
+    </w:lvl>
+    <w:lvl w:ilvl="6" w:tplc="04090001" w:tentative="1">
+      <w:start w:val="1"/>
+      <w:numFmt w:val="bullet"/>
+      <w:lvlText w:val=""/>
+      <w:lvlJc w:val="left"/>
+      <w:pPr>
+        <w:ind w:left="5040" w:hanging="360"/>
+      </w:pPr>
+      <w:rPr>
+        <w:rFonts w:ascii="Symbol" w:hAnsi="Symbol" w:hint="default"/>
+      </w:rPr>
+    </w:lvl>
+    <w:lvl w:ilvl="7" w:tplc="04090003" w:tentative="1">
+      <w:start w:val="1"/>
+      <w:numFmt w:val="bullet"/>
+      <w:lvlText w:val="o"/>
+      <w:lvlJc w:val="left"/>
+      <w:pPr>
+        <w:ind w:left="5760" w:hanging="360"/>
+      </w:pPr>
+      <w:rPr>
+        <w:rFonts w:ascii="Courier New" w:hAnsi="Courier New" w:cs="Courier New" w:hint="default"/>
+      </w:rPr>
+    </w:lvl>
+    <w:lvl w:ilvl="8" w:tplc="04090005" w:tentative="1">
+      <w:start w:val="1"/>
+      <w:numFmt w:val="bullet"/>
+      <w:lvlText w:val=""/>
+      <w:lvlJc w:val="left"/>
+      <w:pPr>
+        <w:ind w:left="6480" w:hanging="360"/>
+      </w:pPr>
+      <w:rPr>
+        <w:rFonts w:ascii="Wingdings" w:hAnsi="Wingdings" w:hint="default"/>
+      </w:rPr>
+    </w:lvl>
+  </w:abstractNum>
+  <w:abstractNum w:abstractNumId="3" w15:restartNumberingAfterBreak="0">
+    <w:nsid w:val="1DC95F3E"/>
+    <w:multiLevelType w:val="hybridMultilevel"/>
+    <w:tmpl w:val="4560097E"/>
+    <w:lvl w:ilvl="0" w:tplc="04090001">
+      <w:start w:val="1"/>
+      <w:numFmt w:val="bullet"/>
+      <w:lvlText w:val=""/>
+      <w:lvlJc w:val="left"/>
+      <w:pPr>
+        <w:ind w:left="3600" w:hanging="360"/>
+      </w:pPr>
+      <w:rPr>
+        <w:rFonts w:ascii="Symbol" w:hAnsi="Symbol" w:hint="default"/>
+      </w:rPr>
+    </w:lvl>
+    <w:lvl w:ilvl="1" w:tplc="04090003" w:tentative="1">
+      <w:start w:val="1"/>
+      <w:numFmt w:val="bullet"/>
+      <w:lvlText w:val="o"/>
+      <w:lvlJc w:val="left"/>
+      <w:pPr>
+        <w:ind w:left="4320" w:hanging="360"/>
+      </w:pPr>
+      <w:rPr>
+        <w:rFonts w:ascii="Courier New" w:hAnsi="Courier New" w:cs="Courier New" w:hint="default"/>
+      </w:rPr>
+    </w:lvl>
+    <w:lvl w:ilvl="2" w:tplc="04090005" w:tentative="1">
+      <w:start w:val="1"/>
+      <w:numFmt w:val="bullet"/>
+      <w:lvlText w:val=""/>
+      <w:lvlJc w:val="left"/>
+      <w:pPr>
+        <w:ind w:left="5040" w:hanging="360"/>
+      </w:pPr>
+      <w:rPr>
+        <w:rFonts w:ascii="Wingdings" w:hAnsi="Wingdings" w:hint="default"/>
+      </w:rPr>
+    </w:lvl>
+    <w:lvl w:ilvl="3" w:tplc="04090001" w:tentative="1">
+      <w:start w:val="1"/>
+      <w:numFmt w:val="bullet"/>
+      <w:lvlText w:val=""/>
+      <w:lvlJc w:val="left"/>
+      <w:pPr>
+        <w:ind w:left="5760" w:hanging="360"/>
+      </w:pPr>
+      <w:rPr>
+        <w:rFonts w:ascii="Symbol" w:hAnsi="Symbol" w:hint="default"/>
+      </w:rPr>
+    </w:lvl>
+    <w:lvl w:ilvl="4" w:tplc="04090003" w:tentative="1">
+      <w:start w:val="1"/>
+      <w:numFmt w:val="bullet"/>
+      <w:lvlText w:val="o"/>
+      <w:lvlJc w:val="left"/>
+      <w:pPr>
+        <w:ind w:left="6480" w:hanging="360"/>
+      </w:pPr>
+      <w:rPr>
+        <w:rFonts w:ascii="Courier New" w:hAnsi="Courier New" w:cs="Courier New" w:hint="default"/>
+      </w:rPr>
+    </w:lvl>
+    <w:lvl w:ilvl="5" w:tplc="04090005" w:tentative="1">
+      <w:start w:val="1"/>
+      <w:numFmt w:val="bullet"/>
+      <w:lvlText w:val=""/>
+      <w:lvlJc w:val="left"/>
+      <w:pPr>
+        <w:ind w:left="7200" w:hanging="360"/>
+      </w:pPr>
+      <w:rPr>
+        <w:rFonts w:ascii="Wingdings" w:hAnsi="Wingdings" w:hint="default"/>
+      </w:rPr>
+    </w:lvl>
+    <w:lvl w:ilvl="6" w:tplc="04090001" w:tentative="1">
+      <w:start w:val="1"/>
+      <w:numFmt w:val="bullet"/>
+      <w:lvlText w:val=""/>
+      <w:lvlJc w:val="left"/>
+      <w:pPr>
+        <w:ind w:left="7920" w:hanging="360"/>
+      </w:pPr>
+      <w:rPr>
+        <w:rFonts w:ascii="Symbol" w:hAnsi="Symbol" w:hint="default"/>
+      </w:rPr>
+    </w:lvl>
+    <w:lvl w:ilvl="7" w:tplc="04090003" w:tentative="1">
+      <w:start w:val="1"/>
+      <w:numFmt w:val="bullet"/>
+      <w:lvlText w:val="o"/>
+      <w:lvlJc w:val="left"/>
+      <w:pPr>
+        <w:ind w:left="8640" w:hanging="360"/>
+      </w:pPr>
+      <w:rPr>
+        <w:rFonts w:ascii="Courier New" w:hAnsi="Courier New" w:cs="Courier New" w:hint="default"/>
+      </w:rPr>
+    </w:lvl>
+    <w:lvl w:ilvl="8" w:tplc="04090005" w:tentative="1">
+      <w:start w:val="1"/>
+      <w:numFmt w:val="bullet"/>
+      <w:lvlText w:val=""/>
+      <w:lvlJc w:val="left"/>
+      <w:pPr>
+        <w:ind w:left="9360" w:hanging="360"/>
+      </w:pPr>
+      <w:rPr>
+        <w:rFonts w:ascii="Wingdings" w:hAnsi="Wingdings" w:hint="default"/>
+      </w:rPr>
+    </w:lvl>
+  </w:abstractNum>
+  <w:abstractNum w:abstractNumId="4" w15:restartNumberingAfterBreak="0">
+    <w:nsid w:val="247026B3"/>
     <w:multiLevelType w:val="multilevel"/>
-    <w:tmpl w:val="256891F4"/>
+    <w:tmpl w:val="B4E677BC"/>
+    <w:lvl w:ilvl="0">
+      <w:start w:val="1"/>
+      <w:numFmt w:val="bullet"/>
+      <w:lvlText w:val="●"/>
+      <w:lvlJc w:val="left"/>
+      <w:pPr>
+        <w:ind w:left="720" w:hanging="360"/>
+      </w:pPr>
+      <w:rPr>
+        <w:u w:val="none"/>
+      </w:rPr>
+    </w:lvl>
+    <w:lvl w:ilvl="1">
+      <w:start w:val="1"/>
+      <w:numFmt w:val="bullet"/>
+      <w:lvlText w:val="○"/>
+      <w:lvlJc w:val="left"/>
+      <w:pPr>
+        <w:ind w:left="1440" w:hanging="360"/>
+      </w:pPr>
+      <w:rPr>
+        <w:u w:val="none"/>
+      </w:rPr>
+    </w:lvl>
+    <w:lvl w:ilvl="2">
+      <w:start w:val="1"/>
+      <w:numFmt w:val="bullet"/>
+      <w:lvlText w:val="■"/>
+      <w:lvlJc w:val="left"/>
+      <w:pPr>
+        <w:ind w:left="2160" w:hanging="360"/>
+      </w:pPr>
+      <w:rPr>
+        <w:u w:val="none"/>
+      </w:rPr>
+    </w:lvl>
+    <w:lvl w:ilvl="3">
+      <w:start w:val="1"/>
+      <w:numFmt w:val="bullet"/>
+      <w:lvlText w:val="●"/>
+      <w:lvlJc w:val="left"/>
+      <w:pPr>
+        <w:ind w:left="2880" w:hanging="360"/>
+      </w:pPr>
+      <w:rPr>
+        <w:u w:val="none"/>
+      </w:rPr>
+    </w:lvl>
+    <w:lvl w:ilvl="4">
+      <w:start w:val="1"/>
+      <w:numFmt w:val="bullet"/>
+      <w:lvlText w:val="○"/>
+      <w:lvlJc w:val="left"/>
+      <w:pPr>
+        <w:ind w:left="3600" w:hanging="360"/>
+      </w:pPr>
+      <w:rPr>
+        <w:u w:val="none"/>
+      </w:rPr>
+    </w:lvl>
+    <w:lvl w:ilvl="5">
+      <w:start w:val="1"/>
+      <w:numFmt w:val="bullet"/>
+      <w:lvlText w:val="■"/>
+      <w:lvlJc w:val="left"/>
+      <w:pPr>
+        <w:ind w:left="4320" w:hanging="360"/>
+      </w:pPr>
+      <w:rPr>
+        <w:u w:val="none"/>
+      </w:rPr>
+    </w:lvl>
+    <w:lvl w:ilvl="6">
+      <w:start w:val="1"/>
+      <w:numFmt w:val="bullet"/>
+      <w:lvlText w:val="●"/>
+      <w:lvlJc w:val="left"/>
+      <w:pPr>
+        <w:ind w:left="5040" w:hanging="360"/>
+      </w:pPr>
+      <w:rPr>
+        <w:u w:val="none"/>
+      </w:rPr>
+    </w:lvl>
+    <w:lvl w:ilvl="7">
+      <w:start w:val="1"/>
+      <w:numFmt w:val="bullet"/>
+      <w:lvlText w:val="○"/>
+      <w:lvlJc w:val="left"/>
+      <w:pPr>
+        <w:ind w:left="5760" w:hanging="360"/>
+      </w:pPr>
+      <w:rPr>
+        <w:u w:val="none"/>
+      </w:rPr>
+    </w:lvl>
+    <w:lvl w:ilvl="8">
+      <w:start w:val="1"/>
+      <w:numFmt w:val="bullet"/>
+      <w:lvlText w:val="■"/>
+      <w:lvlJc w:val="left"/>
+      <w:pPr>
+        <w:ind w:left="6480" w:hanging="360"/>
+      </w:pPr>
+      <w:rPr>
+        <w:u w:val="none"/>
+      </w:rPr>
+    </w:lvl>
+  </w:abstractNum>
+  <w:abstractNum w:abstractNumId="5" w15:restartNumberingAfterBreak="0">
+    <w:nsid w:val="25224DD5"/>
+    <w:multiLevelType w:val="multilevel"/>
+    <w:tmpl w:val="66D0C56E"/>
     <w:lvl w:ilvl="0">
       <w:start w:val="4"/>
       <w:numFmt w:val="bullet"/>
@@ -829,133 +3398,377 @@
       </w:rPr>
     </w:lvl>
   </w:abstractNum>
-  <w:abstractNum w:abstractNumId="2" w15:restartNumberingAfterBreak="0">
-    <w:nsid w:val="72061216"/>
-    <w:multiLevelType w:val="multilevel"/>
-    <w:tmpl w:val="090C5B80"/>
-    <w:lvl w:ilvl="0">
-      <w:start w:val="1"/>
-      <w:numFmt w:val="bullet"/>
-      <w:lvlText w:val="●"/>
+  <w:abstractNum w:abstractNumId="6" w15:restartNumberingAfterBreak="0">
+    <w:nsid w:val="422244C4"/>
+    <w:multiLevelType w:val="hybridMultilevel"/>
+    <w:tmpl w:val="323A5B18"/>
+    <w:lvl w:ilvl="0" w:tplc="04090001">
+      <w:start w:val="1"/>
+      <w:numFmt w:val="bullet"/>
+      <w:lvlText w:val=""/>
+      <w:lvlJc w:val="left"/>
+      <w:pPr>
+        <w:ind w:left="3600" w:hanging="360"/>
+      </w:pPr>
+      <w:rPr>
+        <w:rFonts w:ascii="Symbol" w:hAnsi="Symbol" w:hint="default"/>
+      </w:rPr>
+    </w:lvl>
+    <w:lvl w:ilvl="1" w:tplc="04090003" w:tentative="1">
+      <w:start w:val="1"/>
+      <w:numFmt w:val="bullet"/>
+      <w:lvlText w:val="o"/>
+      <w:lvlJc w:val="left"/>
+      <w:pPr>
+        <w:ind w:left="4320" w:hanging="360"/>
+      </w:pPr>
+      <w:rPr>
+        <w:rFonts w:ascii="Courier New" w:hAnsi="Courier New" w:cs="Courier New" w:hint="default"/>
+      </w:rPr>
+    </w:lvl>
+    <w:lvl w:ilvl="2" w:tplc="04090005" w:tentative="1">
+      <w:start w:val="1"/>
+      <w:numFmt w:val="bullet"/>
+      <w:lvlText w:val=""/>
+      <w:lvlJc w:val="left"/>
+      <w:pPr>
+        <w:ind w:left="5040" w:hanging="360"/>
+      </w:pPr>
+      <w:rPr>
+        <w:rFonts w:ascii="Wingdings" w:hAnsi="Wingdings" w:hint="default"/>
+      </w:rPr>
+    </w:lvl>
+    <w:lvl w:ilvl="3" w:tplc="04090001" w:tentative="1">
+      <w:start w:val="1"/>
+      <w:numFmt w:val="bullet"/>
+      <w:lvlText w:val=""/>
+      <w:lvlJc w:val="left"/>
+      <w:pPr>
+        <w:ind w:left="5760" w:hanging="360"/>
+      </w:pPr>
+      <w:rPr>
+        <w:rFonts w:ascii="Symbol" w:hAnsi="Symbol" w:hint="default"/>
+      </w:rPr>
+    </w:lvl>
+    <w:lvl w:ilvl="4" w:tplc="04090003" w:tentative="1">
+      <w:start w:val="1"/>
+      <w:numFmt w:val="bullet"/>
+      <w:lvlText w:val="o"/>
+      <w:lvlJc w:val="left"/>
+      <w:pPr>
+        <w:ind w:left="6480" w:hanging="360"/>
+      </w:pPr>
+      <w:rPr>
+        <w:rFonts w:ascii="Courier New" w:hAnsi="Courier New" w:cs="Courier New" w:hint="default"/>
+      </w:rPr>
+    </w:lvl>
+    <w:lvl w:ilvl="5" w:tplc="04090005" w:tentative="1">
+      <w:start w:val="1"/>
+      <w:numFmt w:val="bullet"/>
+      <w:lvlText w:val=""/>
+      <w:lvlJc w:val="left"/>
+      <w:pPr>
+        <w:ind w:left="7200" w:hanging="360"/>
+      </w:pPr>
+      <w:rPr>
+        <w:rFonts w:ascii="Wingdings" w:hAnsi="Wingdings" w:hint="default"/>
+      </w:rPr>
+    </w:lvl>
+    <w:lvl w:ilvl="6" w:tplc="04090001" w:tentative="1">
+      <w:start w:val="1"/>
+      <w:numFmt w:val="bullet"/>
+      <w:lvlText w:val=""/>
+      <w:lvlJc w:val="left"/>
+      <w:pPr>
+        <w:ind w:left="7920" w:hanging="360"/>
+      </w:pPr>
+      <w:rPr>
+        <w:rFonts w:ascii="Symbol" w:hAnsi="Symbol" w:hint="default"/>
+      </w:rPr>
+    </w:lvl>
+    <w:lvl w:ilvl="7" w:tplc="04090003" w:tentative="1">
+      <w:start w:val="1"/>
+      <w:numFmt w:val="bullet"/>
+      <w:lvlText w:val="o"/>
+      <w:lvlJc w:val="left"/>
+      <w:pPr>
+        <w:ind w:left="8640" w:hanging="360"/>
+      </w:pPr>
+      <w:rPr>
+        <w:rFonts w:ascii="Courier New" w:hAnsi="Courier New" w:cs="Courier New" w:hint="default"/>
+      </w:rPr>
+    </w:lvl>
+    <w:lvl w:ilvl="8" w:tplc="04090005" w:tentative="1">
+      <w:start w:val="1"/>
+      <w:numFmt w:val="bullet"/>
+      <w:lvlText w:val=""/>
+      <w:lvlJc w:val="left"/>
+      <w:pPr>
+        <w:ind w:left="9360" w:hanging="360"/>
+      </w:pPr>
+      <w:rPr>
+        <w:rFonts w:ascii="Wingdings" w:hAnsi="Wingdings" w:hint="default"/>
+      </w:rPr>
+    </w:lvl>
+  </w:abstractNum>
+  <w:abstractNum w:abstractNumId="7" w15:restartNumberingAfterBreak="0">
+    <w:nsid w:val="6E4A5F85"/>
+    <w:multiLevelType w:val="hybridMultilevel"/>
+    <w:tmpl w:val="7D269916"/>
+    <w:lvl w:ilvl="0" w:tplc="04090001">
+      <w:start w:val="1"/>
+      <w:numFmt w:val="bullet"/>
+      <w:lvlText w:val=""/>
       <w:lvlJc w:val="left"/>
       <w:pPr>
         <w:ind w:left="720" w:hanging="360"/>
       </w:pPr>
       <w:rPr>
-        <w:u w:val="none"/>
-      </w:rPr>
-    </w:lvl>
-    <w:lvl w:ilvl="1">
-      <w:start w:val="1"/>
-      <w:numFmt w:val="bullet"/>
-      <w:lvlText w:val="○"/>
+        <w:rFonts w:ascii="Symbol" w:hAnsi="Symbol" w:hint="default"/>
+      </w:rPr>
+    </w:lvl>
+    <w:lvl w:ilvl="1" w:tplc="04090003" w:tentative="1">
+      <w:start w:val="1"/>
+      <w:numFmt w:val="bullet"/>
+      <w:lvlText w:val="o"/>
       <w:lvlJc w:val="left"/>
       <w:pPr>
         <w:ind w:left="1440" w:hanging="360"/>
       </w:pPr>
       <w:rPr>
-        <w:u w:val="none"/>
-      </w:rPr>
-    </w:lvl>
-    <w:lvl w:ilvl="2">
-      <w:start w:val="1"/>
-      <w:numFmt w:val="bullet"/>
-      <w:lvlText w:val="■"/>
+        <w:rFonts w:ascii="Courier New" w:hAnsi="Courier New" w:cs="Courier New" w:hint="default"/>
+      </w:rPr>
+    </w:lvl>
+    <w:lvl w:ilvl="2" w:tplc="04090005" w:tentative="1">
+      <w:start w:val="1"/>
+      <w:numFmt w:val="bullet"/>
+      <w:lvlText w:val=""/>
       <w:lvlJc w:val="left"/>
       <w:pPr>
         <w:ind w:left="2160" w:hanging="360"/>
       </w:pPr>
       <w:rPr>
-        <w:u w:val="none"/>
-      </w:rPr>
-    </w:lvl>
-    <w:lvl w:ilvl="3">
-      <w:start w:val="1"/>
-      <w:numFmt w:val="bullet"/>
-      <w:lvlText w:val="●"/>
+        <w:rFonts w:ascii="Wingdings" w:hAnsi="Wingdings" w:hint="default"/>
+      </w:rPr>
+    </w:lvl>
+    <w:lvl w:ilvl="3" w:tplc="04090001" w:tentative="1">
+      <w:start w:val="1"/>
+      <w:numFmt w:val="bullet"/>
+      <w:lvlText w:val=""/>
       <w:lvlJc w:val="left"/>
       <w:pPr>
         <w:ind w:left="2880" w:hanging="360"/>
       </w:pPr>
       <w:rPr>
-        <w:u w:val="none"/>
-      </w:rPr>
-    </w:lvl>
-    <w:lvl w:ilvl="4">
-      <w:start w:val="1"/>
-      <w:numFmt w:val="bullet"/>
-      <w:lvlText w:val="○"/>
+        <w:rFonts w:ascii="Symbol" w:hAnsi="Symbol" w:hint="default"/>
+      </w:rPr>
+    </w:lvl>
+    <w:lvl w:ilvl="4" w:tplc="04090003" w:tentative="1">
+      <w:start w:val="1"/>
+      <w:numFmt w:val="bullet"/>
+      <w:lvlText w:val="o"/>
       <w:lvlJc w:val="left"/>
       <w:pPr>
         <w:ind w:left="3600" w:hanging="360"/>
       </w:pPr>
       <w:rPr>
-        <w:u w:val="none"/>
-      </w:rPr>
-    </w:lvl>
-    <w:lvl w:ilvl="5">
-      <w:start w:val="1"/>
-      <w:numFmt w:val="bullet"/>
-      <w:lvlText w:val="■"/>
+        <w:rFonts w:ascii="Courier New" w:hAnsi="Courier New" w:cs="Courier New" w:hint="default"/>
+      </w:rPr>
+    </w:lvl>
+    <w:lvl w:ilvl="5" w:tplc="04090005" w:tentative="1">
+      <w:start w:val="1"/>
+      <w:numFmt w:val="bullet"/>
+      <w:lvlText w:val=""/>
       <w:lvlJc w:val="left"/>
       <w:pPr>
         <w:ind w:left="4320" w:hanging="360"/>
       </w:pPr>
       <w:rPr>
-        <w:u w:val="none"/>
-      </w:rPr>
-    </w:lvl>
-    <w:lvl w:ilvl="6">
-      <w:start w:val="1"/>
-      <w:numFmt w:val="bullet"/>
-      <w:lvlText w:val="●"/>
+        <w:rFonts w:ascii="Wingdings" w:hAnsi="Wingdings" w:hint="default"/>
+      </w:rPr>
+    </w:lvl>
+    <w:lvl w:ilvl="6" w:tplc="04090001" w:tentative="1">
+      <w:start w:val="1"/>
+      <w:numFmt w:val="bullet"/>
+      <w:lvlText w:val=""/>
       <w:lvlJc w:val="left"/>
       <w:pPr>
         <w:ind w:left="5040" w:hanging="360"/>
       </w:pPr>
       <w:rPr>
-        <w:u w:val="none"/>
-      </w:rPr>
-    </w:lvl>
-    <w:lvl w:ilvl="7">
-      <w:start w:val="1"/>
-      <w:numFmt w:val="bullet"/>
-      <w:lvlText w:val="○"/>
+        <w:rFonts w:ascii="Symbol" w:hAnsi="Symbol" w:hint="default"/>
+      </w:rPr>
+    </w:lvl>
+    <w:lvl w:ilvl="7" w:tplc="04090003" w:tentative="1">
+      <w:start w:val="1"/>
+      <w:numFmt w:val="bullet"/>
+      <w:lvlText w:val="o"/>
       <w:lvlJc w:val="left"/>
       <w:pPr>
         <w:ind w:left="5760" w:hanging="360"/>
       </w:pPr>
       <w:rPr>
-        <w:u w:val="none"/>
-      </w:rPr>
-    </w:lvl>
-    <w:lvl w:ilvl="8">
-      <w:start w:val="1"/>
-      <w:numFmt w:val="bullet"/>
-      <w:lvlText w:val="■"/>
+        <w:rFonts w:ascii="Courier New" w:hAnsi="Courier New" w:cs="Courier New" w:hint="default"/>
+      </w:rPr>
+    </w:lvl>
+    <w:lvl w:ilvl="8" w:tplc="04090005" w:tentative="1">
+      <w:start w:val="1"/>
+      <w:numFmt w:val="bullet"/>
+      <w:lvlText w:val=""/>
       <w:lvlJc w:val="left"/>
       <w:pPr>
         <w:ind w:left="6480" w:hanging="360"/>
       </w:pPr>
       <w:rPr>
-        <w:u w:val="none"/>
+        <w:rFonts w:ascii="Wingdings" w:hAnsi="Wingdings" w:hint="default"/>
       </w:rPr>
     </w:lvl>
   </w:abstractNum>
-  <w:num w:numId="1" w16cid:durableId="347484683">
+  <w:abstractNum w:abstractNumId="8" w15:restartNumberingAfterBreak="0">
+    <w:nsid w:val="7EA60892"/>
+    <w:multiLevelType w:val="hybridMultilevel"/>
+    <w:tmpl w:val="D44AC1C2"/>
+    <w:lvl w:ilvl="0" w:tplc="04090001">
+      <w:start w:val="1"/>
+      <w:numFmt w:val="bullet"/>
+      <w:lvlText w:val=""/>
+      <w:lvlJc w:val="left"/>
+      <w:pPr>
+        <w:ind w:left="3600" w:hanging="360"/>
+      </w:pPr>
+      <w:rPr>
+        <w:rFonts w:ascii="Symbol" w:hAnsi="Symbol" w:hint="default"/>
+      </w:rPr>
+    </w:lvl>
+    <w:lvl w:ilvl="1" w:tplc="04090003" w:tentative="1">
+      <w:start w:val="1"/>
+      <w:numFmt w:val="bullet"/>
+      <w:lvlText w:val="o"/>
+      <w:lvlJc w:val="left"/>
+      <w:pPr>
+        <w:ind w:left="4320" w:hanging="360"/>
+      </w:pPr>
+      <w:rPr>
+        <w:rFonts w:ascii="Courier New" w:hAnsi="Courier New" w:cs="Courier New" w:hint="default"/>
+      </w:rPr>
+    </w:lvl>
+    <w:lvl w:ilvl="2" w:tplc="04090005" w:tentative="1">
+      <w:start w:val="1"/>
+      <w:numFmt w:val="bullet"/>
+      <w:lvlText w:val=""/>
+      <w:lvlJc w:val="left"/>
+      <w:pPr>
+        <w:ind w:left="5040" w:hanging="360"/>
+      </w:pPr>
+      <w:rPr>
+        <w:rFonts w:ascii="Wingdings" w:hAnsi="Wingdings" w:hint="default"/>
+      </w:rPr>
+    </w:lvl>
+    <w:lvl w:ilvl="3" w:tplc="04090001" w:tentative="1">
+      <w:start w:val="1"/>
+      <w:numFmt w:val="bullet"/>
+      <w:lvlText w:val=""/>
+      <w:lvlJc w:val="left"/>
+      <w:pPr>
+        <w:ind w:left="5760" w:hanging="360"/>
+      </w:pPr>
+      <w:rPr>
+        <w:rFonts w:ascii="Symbol" w:hAnsi="Symbol" w:hint="default"/>
+      </w:rPr>
+    </w:lvl>
+    <w:lvl w:ilvl="4" w:tplc="04090003" w:tentative="1">
+      <w:start w:val="1"/>
+      <w:numFmt w:val="bullet"/>
+      <w:lvlText w:val="o"/>
+      <w:lvlJc w:val="left"/>
+      <w:pPr>
+        <w:ind w:left="6480" w:hanging="360"/>
+      </w:pPr>
+      <w:rPr>
+        <w:rFonts w:ascii="Courier New" w:hAnsi="Courier New" w:cs="Courier New" w:hint="default"/>
+      </w:rPr>
+    </w:lvl>
+    <w:lvl w:ilvl="5" w:tplc="04090005" w:tentative="1">
+      <w:start w:val="1"/>
+      <w:numFmt w:val="bullet"/>
+      <w:lvlText w:val=""/>
+      <w:lvlJc w:val="left"/>
+      <w:pPr>
+        <w:ind w:left="7200" w:hanging="360"/>
+      </w:pPr>
+      <w:rPr>
+        <w:rFonts w:ascii="Wingdings" w:hAnsi="Wingdings" w:hint="default"/>
+      </w:rPr>
+    </w:lvl>
+    <w:lvl w:ilvl="6" w:tplc="04090001" w:tentative="1">
+      <w:start w:val="1"/>
+      <w:numFmt w:val="bullet"/>
+      <w:lvlText w:val=""/>
+      <w:lvlJc w:val="left"/>
+      <w:pPr>
+        <w:ind w:left="7920" w:hanging="360"/>
+      </w:pPr>
+      <w:rPr>
+        <w:rFonts w:ascii="Symbol" w:hAnsi="Symbol" w:hint="default"/>
+      </w:rPr>
+    </w:lvl>
+    <w:lvl w:ilvl="7" w:tplc="04090003" w:tentative="1">
+      <w:start w:val="1"/>
+      <w:numFmt w:val="bullet"/>
+      <w:lvlText w:val="o"/>
+      <w:lvlJc w:val="left"/>
+      <w:pPr>
+        <w:ind w:left="8640" w:hanging="360"/>
+      </w:pPr>
+      <w:rPr>
+        <w:rFonts w:ascii="Courier New" w:hAnsi="Courier New" w:cs="Courier New" w:hint="default"/>
+      </w:rPr>
+    </w:lvl>
+    <w:lvl w:ilvl="8" w:tplc="04090005" w:tentative="1">
+      <w:start w:val="1"/>
+      <w:numFmt w:val="bullet"/>
+      <w:lvlText w:val=""/>
+      <w:lvlJc w:val="left"/>
+      <w:pPr>
+        <w:ind w:left="9360" w:hanging="360"/>
+      </w:pPr>
+      <w:rPr>
+        <w:rFonts w:ascii="Wingdings" w:hAnsi="Wingdings" w:hint="default"/>
+      </w:rPr>
+    </w:lvl>
+  </w:abstractNum>
+  <w:num w:numId="1" w16cid:durableId="1623071361">
     <w:abstractNumId w:val="0"/>
   </w:num>
-  <w:num w:numId="2" w16cid:durableId="431821068">
+  <w:num w:numId="2" w16cid:durableId="1619025600">
+    <w:abstractNumId w:val="5"/>
+  </w:num>
+  <w:num w:numId="3" w16cid:durableId="1765304738">
+    <w:abstractNumId w:val="4"/>
+  </w:num>
+  <w:num w:numId="4" w16cid:durableId="1350064294">
+    <w:abstractNumId w:val="2"/>
+  </w:num>
+  <w:num w:numId="5" w16cid:durableId="919560054">
+    <w:abstractNumId w:val="7"/>
+  </w:num>
+  <w:num w:numId="6" w16cid:durableId="1594121729">
     <w:abstractNumId w:val="1"/>
   </w:num>
-  <w:num w:numId="3" w16cid:durableId="1412771910">
-    <w:abstractNumId w:val="2"/>
+  <w:num w:numId="7" w16cid:durableId="1123423025">
+    <w:abstractNumId w:val="8"/>
+  </w:num>
+  <w:num w:numId="8" w16cid:durableId="2018267688">
+    <w:abstractNumId w:val="3"/>
+  </w:num>
+  <w:num w:numId="9" w16cid:durableId="3828487">
+    <w:abstractNumId w:val="6"/>
   </w:num>
 </w:numbering>
 </file>
 
 <file path=word/styles.xml><?xml version="1.0" encoding="utf-8"?>
-<w:styles xmlns:mc="http://schemas.openxmlformats.org/markup-compatibility/2006" xmlns:r="http://schemas.openxmlformats.org/officeDocument/2006/relationships" xmlns:w="http://schemas.openxmlformats.org/wordprocessingml/2006/main" xmlns:w14="http://schemas.microsoft.com/office/word/2010/wordml" xmlns:w15="http://schemas.microsoft.com/office/word/2012/wordml" xmlns:w16cex="http://schemas.microsoft.com/office/word/2018/wordml/cex" xmlns:w16cid="http://schemas.microsoft.com/office/word/2016/wordml/cid" xmlns:w16="http://schemas.microsoft.com/office/word/2018/wordml" xmlns:w16du="http://schemas.microsoft.com/office/word/2023/wordml/word16du" xmlns:w16sdtdh="http://schemas.microsoft.com/office/word/2020/wordml/sdtdatahash" xmlns:w16se="http://schemas.microsoft.com/office/word/2015/wordml/symex" mc:Ignorable="w14 w15 w16se w16cid w16 w16cex w16sdtdh w16du">
+<w:styles xmlns:mc="http://schemas.openxmlformats.org/markup-compatibility/2006" xmlns:r="http://schemas.openxmlformats.org/officeDocument/2006/relationships" xmlns:w="http://schemas.openxmlformats.org/wordprocessingml/2006/main" xmlns:w14="http://schemas.microsoft.com/office/word/2010/wordml" xmlns:w15="http://schemas.microsoft.com/office/word/2012/wordml" xmlns:w16cex="http://schemas.microsoft.com/office/word/2018/wordml/cex" xmlns:w16cid="http://schemas.microsoft.com/office/word/2016/wordml/cid" xmlns:w16="http://schemas.microsoft.com/office/word/2018/wordml" xmlns:w16du="http://schemas.microsoft.com/office/word/2023/wordml/word16du" xmlns:w16sdtdh="http://schemas.microsoft.com/office/word/2020/wordml/sdtdatahash" xmlns:w16sdtfl="http://schemas.microsoft.com/office/word/2024/wordml/sdtformatlock" xmlns:w16se="http://schemas.microsoft.com/office/word/2015/wordml/symex" mc:Ignorable="w14 w15 w16se w16cid w16 w16cex w16sdtdh w16sdtfl w16du">
   <w:docDefaults>
     <w:rPrDefault>
       <w:rPr>
@@ -1583,6 +4396,29 @@
       <w:szCs w:val="48"/>
     </w:rPr>
   </w:style>
+  <w:style w:type="character" w:styleId="Hyperlink">
+    <w:name w:val="Hyperlink"/>
+    <w:basedOn w:val="DefaultParagraphFont"/>
+    <w:uiPriority w:val="99"/>
+    <w:unhideWhenUsed/>
+    <w:rsid w:val="007C0986"/>
+    <w:rPr>
+      <w:color w:val="0563C1" w:themeColor="hyperlink"/>
+      <w:u w:val="single"/>
+    </w:rPr>
+  </w:style>
+  <w:style w:type="character" w:styleId="UnresolvedMention">
+    <w:name w:val="Unresolved Mention"/>
+    <w:basedOn w:val="DefaultParagraphFont"/>
+    <w:uiPriority w:val="99"/>
+    <w:semiHidden/>
+    <w:unhideWhenUsed/>
+    <w:rsid w:val="007C0986"/>
+    <w:rPr>
+      <w:color w:val="605E5C"/>
+      <w:shd w:val="clear" w:color="auto" w:fill="E1DFDD"/>
+    </w:rPr>
+  </w:style>
 </w:styles>
 </file>
 
@@ -1848,8 +4684,8 @@
 </file>
 
 <file path=customXml/item1.xml><?xml version="1.0" encoding="utf-8"?>
-<go:gDocsCustomXmlDataStorage xmlns:go="http://customooxmlschemas.google.com/" xmlns:r="http://schemas.openxmlformats.org/officeDocument/2006/relationships">
-  <go:docsCustomData xmlns:go="http://customooxmlschemas.google.com/" roundtripDataSignature="AMtx7mimllelLUOCGJju7g1IF/bpIly8jA==">AMUW2mU3CQ5nUg5+C84RaW886aYiZcGr0ydUZY5RhDKWBfykK5govDi+7YKsEq8E4/75Q7KF/ez5SD6G/q3xFpyFkHyTtDUmRoSz/jPC+yBFfdEnTEPhFW0fWKMBikf65rO33Z/JMn+/</go:docsCustomData>
+<go:gDocsCustomXmlDataStorage xmlns:go="http://customooxmlschemas.google.com/" xmlns:r="http://schemas.openxmlformats.org/officeDocument/2006/relationships" uri="GoogleDocsCustomDataVersion1">
+  <go:docsCustomData xmlns:go="http://customooxmlschemas.google.com/" roundtripDataSignature="AMtx7mimllelLUOCGJju7g1IF/bpIly8jA==">AMUW2mXIPfiVaxry0mK1w+LL7Esu8b/NMOii5aafa9Set1yCuQ997jUryZmVFXOqHf4tDOw9sQWslKVNaf2U/aaAsszyN+YSBQGKo5Cwx3HJ3oCqYx1InpAlC6OlgXQI/SjhOl2SkcyN</go:docsCustomData>
 </go:gDocsCustomXmlDataStorage>
 </file>
 

</xml_diff>